<commit_message>
Update project to executed full-mode results and regenerate artifacts/docs
</commit_message>
<xml_diff>
--- a/PowerShield_FL_Conference_Paper.docx
+++ b/PowerShield_FL_Conference_Paper.docx
@@ -167,7 +167,7 @@
                 <w:color w:val="222222"/>
                 <w:sz w:val="18"/>
               </w:rPr>
-              <w:t xml:space="preserve"> All experimental numbers in this manuscript were produced by the final QUICK-mode suite </w:t>
+              <w:t xml:space="preserve"> All experimental numbers in this manuscript were produced by the final FULL-mode suite </w:t>
             </w:r>
             <w:r>
               <w:rPr>
@@ -177,7 +177,7 @@
                 <w:color w:val="222222"/>
                 <w:sz w:val="16"/>
               </w:rPr>
-              <w:t>experiment_20261025_014623_793809_suite_s42</w:t>
+              <w:t>experiment_20261028_072746_856067_suite_s42</w:t>
             </w:r>
             <w:r>
               <w:rPr>
@@ -187,7 +187,7 @@
                 <w:color w:val="222222"/>
                 <w:sz w:val="18"/>
               </w:rPr>
-              <w:t xml:space="preserve"> on a synthetic smart-meter benchmark. No real utility or customer data were used. </w:t>
+              <w:t xml:space="preserve"> on a synthetic smart-meter benchmark: 600 consumers, 10 clients, 25 federated rounds, seeds [42, 123, 2026]. No real utility or customer data were used. Real-data execution is </w:t>
             </w:r>
             <w:r>
               <w:rPr>
@@ -197,7 +197,17 @@
                 <w:color w:val="222222"/>
                 <w:sz w:val="18"/>
               </w:rPr>
-              <w:t>Full mode is NOT RUN. Real-data execution is DATASET NOT CONFIGURED.</w:t>
+              <w:t>DATASET NOT CONFIGURED</w:t>
+            </w:r>
+            <w:r>
+              <w:rPr>
+                <w:rFonts w:ascii="Cambria" w:hAnsi="Cambria" w:eastAsia="Cambria"/>
+                <w:b w:val="0"/>
+                <w:i w:val="0"/>
+                <w:color w:val="222222"/>
+                <w:sz w:val="18"/>
+              </w:rPr>
+              <w:t>.</w:t>
             </w:r>
           </w:p>
           <w:p>
@@ -222,7 +232,7 @@
                 <w:color w:val="222222"/>
                 <w:sz w:val="18"/>
               </w:rPr>
-              <w:t xml:space="preserve"> The results are single-seed, descriptive measurements. No statistical significance, formal end-to-end differential privacy, production secure aggregation, or real-world deployment claim is made.</w:t>
+              <w:t xml:space="preserve"> Window-level F1 differences between FedAvg and PowerShield-FL are not statistically significant (paired t p = 0.4038; Wilcoxon p = 0.5 over 3 seeds). No formal end-to-end differential privacy, production secure aggregation, or real-world deployment claim is made.</w:t>
             </w:r>
           </w:p>
         </w:tc>
@@ -285,7 +295,7 @@
           <w:color w:val="222222"/>
           <w:sz w:val="19"/>
         </w:rPr>
-        <w:t xml:space="preserve">, an end-to-end research framework that combines a lightweight multi-layer perceptron, consumer-level non-IID client simulation, update clipping with Gaussian perturbation, measured communication compression, adaptive size-quality-reliability aggregation, and post-hoc explainability. We evaluate the framework on a synthetic 240-consumer benchmark in QUICK mode with five clients, eight federated rounds, and one seed. At the window level, PowerShield-FL reaches F1 = 0.9969 (precision = 1.0000, recall = 0.9938), compared with F1 = 0.9938 for FedAvg, while transmitting 902,449 bytes rather than 3,453,520 bytes—a measured reduction of 73.87%. The proposed pipeline matches the F1 of a centralized Random Forest (0.9969) without pooling raw records, although the centralized model is trained on pooled data and the comparison is not compute-matched. The apparent +0.0031 F1 advantage over FedAvg corresponds to </w:t>
+        <w:t xml:space="preserve">, an end-to-end research framework that combines a lightweight multi-layer perceptron, consumer-level non-IID client simulation, update clipping with Gaussian perturbation, measured communication compression, adaptive size-quality-reliability aggregation, and post-hoc explainability. We evaluate the framework on a synthetic 600-consumer benchmark in FULL mode with ten clients, 25 federated rounds, and three seeds. At the window level, PowerShield-FL reaches F1 = 0.9802 ± 0.0090 (precision = 0.9989, recall = 0.9622), compared with F1 = 0.9823 ± 0.0071 for FedAvg, while transmitting 5,640,225 bytes rather than 21,584,500 bytes per seed—a measured reduction of 73.87%. The difference in F1 is not statistically significant (paired t p = 0.4038; Wilcoxon p = 0.5). The proposed pipeline is competitive with centralized baselines on window-level F1 (lightweight MLP 0.9839) without pooling raw records, although centralized models are trained on pooled data and the comparison is not compute-matched. Consumer-level F1 ranges from 0.3529 to 0.6667 across seeds at a fixed mean-probability threshold of 0.5, even though consumer-level ROC-AUC is 1.0; the gap is a calibration and threshold problem, not a ranking failure. The privacy layer is update-level clipping plus Gaussian noise with single-release ε estimates between 807 and 4,845; secure aggregation is simulated and disabled, and no formal end-to-end differential-privacy guarantee is claimed. Real-data experiments are </w:t>
       </w:r>
       <w:r>
         <w:rPr>
@@ -295,7 +305,7 @@
           <w:color w:val="222222"/>
           <w:sz w:val="19"/>
         </w:rPr>
-        <w:t>one additional true-positive window</w:t>
+        <w:t>DATASET NOT CONFIGURED</w:t>
       </w:r>
       <w:r>
         <w:rPr>
@@ -305,47 +315,7 @@
           <w:color w:val="222222"/>
           <w:sz w:val="19"/>
         </w:rPr>
-        <w:t xml:space="preserve"> out of 162 theft windows and is not statistically significant. More importantly, consumer-level F1 is only 0.25 for both methods at a fixed mean-probability threshold of 0.5, even though consumer-level ROC-AUC is 1.0; the gap is a calibration and threshold problem, not a ranking failure. The privacy layer is update-level clipping plus Gaussian noise with single-release ε estimates between 807 and 4,845; secure aggregation is simulated and disabled, and no formal end-to-end differential-privacy guarantee is claimed. Full mode and real-data experiments are </w:t>
-      </w:r>
-      <w:r>
-        <w:rPr>
-          <w:rFonts w:ascii="Cambria" w:hAnsi="Cambria" w:eastAsia="Cambria"/>
-          <w:b/>
-          <w:i w:val="0"/>
-          <w:color w:val="222222"/>
-          <w:sz w:val="19"/>
-        </w:rPr>
-        <w:t>NOT RUN</w:t>
-      </w:r>
-      <w:r>
-        <w:rPr>
-          <w:rFonts w:ascii="Cambria" w:hAnsi="Cambria" w:eastAsia="Cambria"/>
-          <w:b w:val="0"/>
-          <w:i w:val="0"/>
-          <w:color w:val="222222"/>
-          <w:sz w:val="19"/>
-        </w:rPr>
-        <w:t xml:space="preserve"> and </w:t>
-      </w:r>
-      <w:r>
-        <w:rPr>
-          <w:rFonts w:ascii="Cambria" w:hAnsi="Cambria" w:eastAsia="Cambria"/>
-          <w:b/>
-          <w:i w:val="0"/>
-          <w:color w:val="222222"/>
-          <w:sz w:val="19"/>
-        </w:rPr>
-        <w:t>DATASET NOT CONFIGURED</w:t>
-      </w:r>
-      <w:r>
-        <w:rPr>
-          <w:rFonts w:ascii="Cambria" w:hAnsi="Cambria" w:eastAsia="Cambria"/>
-          <w:b w:val="0"/>
-          <w:i w:val="0"/>
-          <w:color w:val="222222"/>
-          <w:sz w:val="19"/>
-        </w:rPr>
-        <w:t>, respectively. The study supports the feasibility of lightweight, communication-efficient FL on synthetic data—not real-world deployment.</w:t>
+        <w:t>. The study supports the feasibility of lightweight, communication-efficient FL on synthetic data.</w:t>
       </w:r>
     </w:p>
     <w:p>
@@ -1671,7 +1641,7 @@
           <w:color w:val="222222"/>
           <w:sz w:val="20"/>
         </w:rPr>
-        <w:t>The synthetic generator creates 240 consumers over 180 days at 30-minute resolution: 2,073,600 raw rows in total. Each consumer has a base load, an intraday profile, seasonal and weekend factors, Gaussian noise, missing values, and occasional spikes. Fifteen percent of consumers (36 of 240) are assigned a theft episode. For a theft consumer, metered consumption is multiplied by a scale factor between 0.35 and 0.85 from a random activation day, with a 25% chance that a given day is inactive; the activation day lies between 25% and 85% of the observation period. These settings produce a detectable but non-trivial pattern of level reduction.</w:t>
+        <w:t>The synthetic generator creates 600 consumers over 365 days at 30-minute resolution: 10,512,000 raw rows in total. Each consumer has a base load, an intraday profile, seasonal and weekend factors, Gaussian noise, missing values, and occasional spikes. Twelve percent of consumers (72 of 600) are assigned a theft episode. For a theft consumer, metered consumption is multiplied by a scale factor between 0.35 and 0.85 from a random activation day, with a 25% chance that a given day is inactive; the activation day lies between 25% and 85% of the observation period. These settings produce a detectable but non-trivial pattern of level reduction.</w:t>
       </w:r>
     </w:p>
     <w:p>
@@ -2942,7 +2912,7 @@
           <w:color w:val="222222"/>
           <w:sz w:val="20"/>
         </w:rPr>
-        <w:t xml:space="preserve"> in every artifact. It contains 2,073,600 raw rows, 4,244 missing values, and zero duplicate rows. The 240 consumers are split into 156 training, 36 validation, and 48 test consumers. The training split is used for client partitioning; the validation split is held by the server; the test split is untouched until final evaluation.</w:t>
+        <w:t xml:space="preserve"> in every artifact. It contains 10,512,000 raw rows, 20,802 missing values, and zero duplicate rows. The 600 consumers are split into 390 training, 90 validation, and 120 test consumers. The training split is used for client partitioning; the validation split is held by the server; the test split is untouched until final evaluation.</w:t>
       </w:r>
     </w:p>
     <w:p>
@@ -2985,11 +2955,11 @@
         </w:tblCellMar>
       </w:tblPr>
       <w:tblGrid>
-        <w:gridCol w:w="4295"/>
-        <w:gridCol w:w="1074"/>
-        <w:gridCol w:w="2147"/>
-        <w:gridCol w:w="1074"/>
-        <w:gridCol w:w="1288"/>
+        <w:gridCol w:w="4116"/>
+        <w:gridCol w:w="1235"/>
+        <w:gridCol w:w="2058"/>
+        <w:gridCol w:w="1235"/>
+        <w:gridCol w:w="1235"/>
       </w:tblGrid>
       <w:tr>
         <w:trPr>
@@ -2998,7 +2968,7 @@
         </w:trPr>
         <w:tc>
           <w:tcPr>
-            <w:tcW w:type="dxa" w:w="4295"/>
+            <w:tcW w:type="dxa" w:w="4116"/>
             <w:vAlign w:val="center"/>
             <w:shd w:val="clear" w:color="auto" w:fill="1F3864"/>
           </w:tcPr>
@@ -3021,7 +2991,7 @@
         </w:tc>
         <w:tc>
           <w:tcPr>
-            <w:tcW w:type="dxa" w:w="1074"/>
+            <w:tcW w:type="dxa" w:w="1235"/>
             <w:vAlign w:val="center"/>
             <w:shd w:val="clear" w:color="auto" w:fill="1F3864"/>
           </w:tcPr>
@@ -3044,7 +3014,7 @@
         </w:tc>
         <w:tc>
           <w:tcPr>
-            <w:tcW w:type="dxa" w:w="2147"/>
+            <w:tcW w:type="dxa" w:w="2058"/>
             <w:vAlign w:val="center"/>
             <w:shd w:val="clear" w:color="auto" w:fill="1F3864"/>
           </w:tcPr>
@@ -3067,7 +3037,7 @@
         </w:tc>
         <w:tc>
           <w:tcPr>
-            <w:tcW w:type="dxa" w:w="1074"/>
+            <w:tcW w:type="dxa" w:w="1235"/>
             <w:vAlign w:val="center"/>
             <w:shd w:val="clear" w:color="auto" w:fill="1F3864"/>
           </w:tcPr>
@@ -3090,7 +3060,7 @@
         </w:tc>
         <w:tc>
           <w:tcPr>
-            <w:tcW w:type="dxa" w:w="1288"/>
+            <w:tcW w:type="dxa" w:w="1235"/>
             <w:vAlign w:val="center"/>
             <w:shd w:val="clear" w:color="auto" w:fill="1F3864"/>
           </w:tcPr>
@@ -3118,7 +3088,7 @@
         </w:trPr>
         <w:tc>
           <w:tcPr>
-            <w:tcW w:type="dxa" w:w="4295"/>
+            <w:tcW w:type="dxa" w:w="4116"/>
             <w:vAlign w:val="center"/>
           </w:tcPr>
           <w:p>
@@ -3140,7 +3110,7 @@
         </w:tc>
         <w:tc>
           <w:tcPr>
-            <w:tcW w:type="dxa" w:w="1074"/>
+            <w:tcW w:type="dxa" w:w="1235"/>
             <w:vAlign w:val="center"/>
           </w:tcPr>
           <w:p>
@@ -3156,13 +3126,13 @@
                 <w:color w:val="222222"/>
                 <w:sz w:val="16"/>
               </w:rPr>
-              <w:t>156</w:t>
-            </w:r>
-          </w:p>
-        </w:tc>
-        <w:tc>
-          <w:tcPr>
-            <w:tcW w:type="dxa" w:w="2147"/>
+              <w:t>390</w:t>
+            </w:r>
+          </w:p>
+        </w:tc>
+        <w:tc>
+          <w:tcPr>
+            <w:tcW w:type="dxa" w:w="2058"/>
             <w:vAlign w:val="center"/>
           </w:tcPr>
           <w:p>
@@ -3178,13 +3148,13 @@
                 <w:color w:val="222222"/>
                 <w:sz w:val="16"/>
               </w:rPr>
-              <w:t>36</w:t>
-            </w:r>
-          </w:p>
-        </w:tc>
-        <w:tc>
-          <w:tcPr>
-            <w:tcW w:type="dxa" w:w="1074"/>
+              <w:t>90</w:t>
+            </w:r>
+          </w:p>
+        </w:tc>
+        <w:tc>
+          <w:tcPr>
+            <w:tcW w:type="dxa" w:w="1235"/>
             <w:vAlign w:val="center"/>
           </w:tcPr>
           <w:p>
@@ -3200,13 +3170,13 @@
                 <w:color w:val="222222"/>
                 <w:sz w:val="16"/>
               </w:rPr>
-              <w:t>48</w:t>
-            </w:r>
-          </w:p>
-        </w:tc>
-        <w:tc>
-          <w:tcPr>
-            <w:tcW w:type="dxa" w:w="1288"/>
+              <w:t>120</w:t>
+            </w:r>
+          </w:p>
+        </w:tc>
+        <w:tc>
+          <w:tcPr>
+            <w:tcW w:type="dxa" w:w="1235"/>
             <w:vAlign w:val="center"/>
           </w:tcPr>
           <w:p>
@@ -3222,7 +3192,7 @@
                 <w:color w:val="222222"/>
                 <w:sz w:val="16"/>
               </w:rPr>
-              <w:t>240</w:t>
+              <w:t>600</w:t>
             </w:r>
           </w:p>
         </w:tc>
@@ -3233,7 +3203,7 @@
         </w:trPr>
         <w:tc>
           <w:tcPr>
-            <w:tcW w:type="dxa" w:w="4295"/>
+            <w:tcW w:type="dxa" w:w="4116"/>
             <w:vAlign w:val="center"/>
             <w:shd w:val="clear" w:color="auto" w:fill="F2F5F9"/>
           </w:tcPr>
@@ -3250,13 +3220,13 @@
                 <w:color w:val="222222"/>
                 <w:sz w:val="16"/>
               </w:rPr>
-              <w:t>Theft consumers</w:t>
-            </w:r>
-          </w:p>
-        </w:tc>
-        <w:tc>
-          <w:tcPr>
-            <w:tcW w:type="dxa" w:w="1074"/>
+              <w:t>Windows</w:t>
+            </w:r>
+          </w:p>
+        </w:tc>
+        <w:tc>
+          <w:tcPr>
+            <w:tcW w:type="dxa" w:w="1235"/>
             <w:vAlign w:val="center"/>
             <w:shd w:val="clear" w:color="auto" w:fill="F2F5F9"/>
           </w:tcPr>
@@ -3273,13 +3243,13 @@
                 <w:color w:val="222222"/>
                 <w:sz w:val="16"/>
               </w:rPr>
-              <w:t>24</w:t>
-            </w:r>
-          </w:p>
-        </w:tc>
-        <w:tc>
-          <w:tcPr>
-            <w:tcW w:type="dxa" w:w="2147"/>
+              <w:t>46,020</w:t>
+            </w:r>
+          </w:p>
+        </w:tc>
+        <w:tc>
+          <w:tcPr>
+            <w:tcW w:type="dxa" w:w="2058"/>
             <w:vAlign w:val="center"/>
             <w:shd w:val="clear" w:color="auto" w:fill="F2F5F9"/>
           </w:tcPr>
@@ -3296,13 +3266,13 @@
                 <w:color w:val="222222"/>
                 <w:sz w:val="16"/>
               </w:rPr>
-              <w:t>5</w:t>
-            </w:r>
-          </w:p>
-        </w:tc>
-        <w:tc>
-          <w:tcPr>
-            <w:tcW w:type="dxa" w:w="1074"/>
+              <w:t>10,620</w:t>
+            </w:r>
+          </w:p>
+        </w:tc>
+        <w:tc>
+          <w:tcPr>
+            <w:tcW w:type="dxa" w:w="1235"/>
             <w:vAlign w:val="center"/>
             <w:shd w:val="clear" w:color="auto" w:fill="F2F5F9"/>
           </w:tcPr>
@@ -3319,13 +3289,13 @@
                 <w:color w:val="222222"/>
                 <w:sz w:val="16"/>
               </w:rPr>
-              <w:t>7</w:t>
-            </w:r>
-          </w:p>
-        </w:tc>
-        <w:tc>
-          <w:tcPr>
-            <w:tcW w:type="dxa" w:w="1288"/>
+              <w:t>14,160</w:t>
+            </w:r>
+          </w:p>
+        </w:tc>
+        <w:tc>
+          <w:tcPr>
+            <w:tcW w:type="dxa" w:w="1235"/>
             <w:vAlign w:val="center"/>
             <w:shd w:val="clear" w:color="auto" w:fill="F2F5F9"/>
           </w:tcPr>
@@ -3342,7 +3312,7 @@
                 <w:color w:val="222222"/>
                 <w:sz w:val="16"/>
               </w:rPr>
-              <w:t>36</w:t>
+              <w:t>70,800</w:t>
             </w:r>
           </w:p>
         </w:tc>
@@ -3353,7 +3323,7 @@
         </w:trPr>
         <w:tc>
           <w:tcPr>
-            <w:tcW w:type="dxa" w:w="4295"/>
+            <w:tcW w:type="dxa" w:w="4116"/>
             <w:vAlign w:val="center"/>
           </w:tcPr>
           <w:p>
@@ -3369,13 +3339,13 @@
                 <w:color w:val="222222"/>
                 <w:sz w:val="16"/>
               </w:rPr>
-              <w:t>Windows</w:t>
-            </w:r>
-          </w:p>
-        </w:tc>
-        <w:tc>
-          <w:tcPr>
-            <w:tcW w:type="dxa" w:w="1074"/>
+              <w:t>Theft windows</w:t>
+            </w:r>
+          </w:p>
+        </w:tc>
+        <w:tc>
+          <w:tcPr>
+            <w:tcW w:type="dxa" w:w="1235"/>
             <w:vAlign w:val="center"/>
           </w:tcPr>
           <w:p>
@@ -3391,13 +3361,13 @@
                 <w:color w:val="222222"/>
                 <w:sz w:val="16"/>
               </w:rPr>
-              <w:t>8,736</w:t>
-            </w:r>
-          </w:p>
-        </w:tc>
-        <w:tc>
-          <w:tcPr>
-            <w:tcW w:type="dxa" w:w="2147"/>
+              <w:t>2,761</w:t>
+            </w:r>
+          </w:p>
+        </w:tc>
+        <w:tc>
+          <w:tcPr>
+            <w:tcW w:type="dxa" w:w="2058"/>
             <w:vAlign w:val="center"/>
           </w:tcPr>
           <w:p>
@@ -3413,13 +3383,13 @@
                 <w:color w:val="222222"/>
                 <w:sz w:val="16"/>
               </w:rPr>
-              <w:t>2,016</w:t>
-            </w:r>
-          </w:p>
-        </w:tc>
-        <w:tc>
-          <w:tcPr>
-            <w:tcW w:type="dxa" w:w="1074"/>
+              <w:t>599</w:t>
+            </w:r>
+          </w:p>
+        </w:tc>
+        <w:tc>
+          <w:tcPr>
+            <w:tcW w:type="dxa" w:w="1235"/>
             <w:vAlign w:val="center"/>
           </w:tcPr>
           <w:p>
@@ -3435,13 +3405,13 @@
                 <w:color w:val="222222"/>
                 <w:sz w:val="16"/>
               </w:rPr>
-              <w:t>2,688</w:t>
-            </w:r>
-          </w:p>
-        </w:tc>
-        <w:tc>
-          <w:tcPr>
-            <w:tcW w:type="dxa" w:w="1288"/>
+              <w:t>853</w:t>
+            </w:r>
+          </w:p>
+        </w:tc>
+        <w:tc>
+          <w:tcPr>
+            <w:tcW w:type="dxa" w:w="1235"/>
             <w:vAlign w:val="center"/>
           </w:tcPr>
           <w:p>
@@ -3457,7 +3427,7 @@
                 <w:color w:val="222222"/>
                 <w:sz w:val="16"/>
               </w:rPr>
-              <w:t>13,440</w:t>
+              <w:t>4,213</w:t>
             </w:r>
           </w:p>
         </w:tc>
@@ -3468,7 +3438,7 @@
         </w:trPr>
         <w:tc>
           <w:tcPr>
-            <w:tcW w:type="dxa" w:w="4295"/>
+            <w:tcW w:type="dxa" w:w="4116"/>
             <w:vAlign w:val="center"/>
             <w:shd w:val="clear" w:color="auto" w:fill="F2F5F9"/>
           </w:tcPr>
@@ -3485,13 +3455,13 @@
                 <w:color w:val="222222"/>
                 <w:sz w:val="16"/>
               </w:rPr>
-              <w:t>Theft windows</w:t>
-            </w:r>
-          </w:p>
-        </w:tc>
-        <w:tc>
-          <w:tcPr>
-            <w:tcW w:type="dxa" w:w="1074"/>
+              <w:t>Theft ratio</w:t>
+            </w:r>
+          </w:p>
+        </w:tc>
+        <w:tc>
+          <w:tcPr>
+            <w:tcW w:type="dxa" w:w="1235"/>
             <w:vAlign w:val="center"/>
             <w:shd w:val="clear" w:color="auto" w:fill="F2F5F9"/>
           </w:tcPr>
@@ -3508,13 +3478,13 @@
                 <w:color w:val="222222"/>
                 <w:sz w:val="16"/>
               </w:rPr>
-              <w:t>706</w:t>
-            </w:r>
-          </w:p>
-        </w:tc>
-        <w:tc>
-          <w:tcPr>
-            <w:tcW w:type="dxa" w:w="2147"/>
+              <w:t>6.00%</w:t>
+            </w:r>
+          </w:p>
+        </w:tc>
+        <w:tc>
+          <w:tcPr>
+            <w:tcW w:type="dxa" w:w="2058"/>
             <w:vAlign w:val="center"/>
             <w:shd w:val="clear" w:color="auto" w:fill="F2F5F9"/>
           </w:tcPr>
@@ -3531,13 +3501,13 @@
                 <w:color w:val="222222"/>
                 <w:sz w:val="16"/>
               </w:rPr>
-              <w:t>176</w:t>
-            </w:r>
-          </w:p>
-        </w:tc>
-        <w:tc>
-          <w:tcPr>
-            <w:tcW w:type="dxa" w:w="1074"/>
+              <w:t>5.64%</w:t>
+            </w:r>
+          </w:p>
+        </w:tc>
+        <w:tc>
+          <w:tcPr>
+            <w:tcW w:type="dxa" w:w="1235"/>
             <w:vAlign w:val="center"/>
             <w:shd w:val="clear" w:color="auto" w:fill="F2F5F9"/>
           </w:tcPr>
@@ -3554,13 +3524,13 @@
                 <w:color w:val="222222"/>
                 <w:sz w:val="16"/>
               </w:rPr>
-              <w:t>162</w:t>
-            </w:r>
-          </w:p>
-        </w:tc>
-        <w:tc>
-          <w:tcPr>
-            <w:tcW w:type="dxa" w:w="1288"/>
+              <w:t>6.02%</w:t>
+            </w:r>
+          </w:p>
+        </w:tc>
+        <w:tc>
+          <w:tcPr>
+            <w:tcW w:type="dxa" w:w="1235"/>
             <w:vAlign w:val="center"/>
             <w:shd w:val="clear" w:color="auto" w:fill="F2F5F9"/>
           </w:tcPr>
@@ -3577,7 +3547,7 @@
                 <w:color w:val="222222"/>
                 <w:sz w:val="16"/>
               </w:rPr>
-              <w:t>1,044</w:t>
+              <w:t>5.95%</w:t>
             </w:r>
           </w:p>
         </w:tc>
@@ -3588,7 +3558,7 @@
         </w:trPr>
         <w:tc>
           <w:tcPr>
-            <w:tcW w:type="dxa" w:w="4295"/>
+            <w:tcW w:type="dxa" w:w="4116"/>
             <w:vAlign w:val="center"/>
           </w:tcPr>
           <w:p>
@@ -3604,13 +3574,13 @@
                 <w:color w:val="222222"/>
                 <w:sz w:val="16"/>
               </w:rPr>
-              <w:t>Theft ratio</w:t>
-            </w:r>
-          </w:p>
-        </w:tc>
-        <w:tc>
-          <w:tcPr>
-            <w:tcW w:type="dxa" w:w="1074"/>
+              <w:t>Windows per consumer</w:t>
+            </w:r>
+          </w:p>
+        </w:tc>
+        <w:tc>
+          <w:tcPr>
+            <w:tcW w:type="dxa" w:w="1235"/>
             <w:vAlign w:val="center"/>
           </w:tcPr>
           <w:p>
@@ -3626,13 +3596,13 @@
                 <w:color w:val="222222"/>
                 <w:sz w:val="16"/>
               </w:rPr>
-              <w:t>8.08%</w:t>
-            </w:r>
-          </w:p>
-        </w:tc>
-        <w:tc>
-          <w:tcPr>
-            <w:tcW w:type="dxa" w:w="2147"/>
+              <w:t>118</w:t>
+            </w:r>
+          </w:p>
+        </w:tc>
+        <w:tc>
+          <w:tcPr>
+            <w:tcW w:type="dxa" w:w="2058"/>
             <w:vAlign w:val="center"/>
           </w:tcPr>
           <w:p>
@@ -3648,13 +3618,13 @@
                 <w:color w:val="222222"/>
                 <w:sz w:val="16"/>
               </w:rPr>
-              <w:t>8.73%</w:t>
-            </w:r>
-          </w:p>
-        </w:tc>
-        <w:tc>
-          <w:tcPr>
-            <w:tcW w:type="dxa" w:w="1074"/>
+              <w:t>118</w:t>
+            </w:r>
+          </w:p>
+        </w:tc>
+        <w:tc>
+          <w:tcPr>
+            <w:tcW w:type="dxa" w:w="1235"/>
             <w:vAlign w:val="center"/>
           </w:tcPr>
           <w:p>
@@ -3670,13 +3640,13 @@
                 <w:color w:val="222222"/>
                 <w:sz w:val="16"/>
               </w:rPr>
-              <w:t>6.03%</w:t>
-            </w:r>
-          </w:p>
-        </w:tc>
-        <w:tc>
-          <w:tcPr>
-            <w:tcW w:type="dxa" w:w="1288"/>
+              <w:t>118</w:t>
+            </w:r>
+          </w:p>
+        </w:tc>
+        <w:tc>
+          <w:tcPr>
+            <w:tcW w:type="dxa" w:w="1235"/>
             <w:vAlign w:val="center"/>
           </w:tcPr>
           <w:p>
@@ -3692,127 +3662,7 @@
                 <w:color w:val="222222"/>
                 <w:sz w:val="16"/>
               </w:rPr>
-              <w:t>7.77%</w:t>
-            </w:r>
-          </w:p>
-        </w:tc>
-      </w:tr>
-      <w:tr>
-        <w:trPr>
-          <w:cantSplit/>
-        </w:trPr>
-        <w:tc>
-          <w:tcPr>
-            <w:tcW w:type="dxa" w:w="4295"/>
-            <w:vAlign w:val="center"/>
-            <w:shd w:val="clear" w:color="auto" w:fill="F2F5F9"/>
-          </w:tcPr>
-          <w:p>
-            <w:pPr>
-              <w:spacing w:after="0" w:line="240" w:lineRule="auto"/>
-              <w:jc w:val="left"/>
-            </w:pPr>
-            <w:r>
-              <w:rPr>
-                <w:rFonts w:ascii="Cambria" w:hAnsi="Cambria" w:eastAsia="Cambria"/>
-                <w:b w:val="0"/>
-                <w:i w:val="0"/>
-                <w:color w:val="222222"/>
-                <w:sz w:val="16"/>
-              </w:rPr>
-              <w:t>Windows per consumer</w:t>
-            </w:r>
-          </w:p>
-        </w:tc>
-        <w:tc>
-          <w:tcPr>
-            <w:tcW w:type="dxa" w:w="1074"/>
-            <w:vAlign w:val="center"/>
-            <w:shd w:val="clear" w:color="auto" w:fill="F2F5F9"/>
-          </w:tcPr>
-          <w:p>
-            <w:pPr>
-              <w:spacing w:after="0" w:line="240" w:lineRule="auto"/>
-              <w:jc w:val="left"/>
-            </w:pPr>
-            <w:r>
-              <w:rPr>
-                <w:rFonts w:ascii="Cambria" w:hAnsi="Cambria" w:eastAsia="Cambria"/>
-                <w:b w:val="0"/>
-                <w:i w:val="0"/>
-                <w:color w:val="222222"/>
-                <w:sz w:val="16"/>
-              </w:rPr>
-              <w:t>56</w:t>
-            </w:r>
-          </w:p>
-        </w:tc>
-        <w:tc>
-          <w:tcPr>
-            <w:tcW w:type="dxa" w:w="2147"/>
-            <w:vAlign w:val="center"/>
-            <w:shd w:val="clear" w:color="auto" w:fill="F2F5F9"/>
-          </w:tcPr>
-          <w:p>
-            <w:pPr>
-              <w:spacing w:after="0" w:line="240" w:lineRule="auto"/>
-              <w:jc w:val="left"/>
-            </w:pPr>
-            <w:r>
-              <w:rPr>
-                <w:rFonts w:ascii="Cambria" w:hAnsi="Cambria" w:eastAsia="Cambria"/>
-                <w:b w:val="0"/>
-                <w:i w:val="0"/>
-                <w:color w:val="222222"/>
-                <w:sz w:val="16"/>
-              </w:rPr>
-              <w:t>56</w:t>
-            </w:r>
-          </w:p>
-        </w:tc>
-        <w:tc>
-          <w:tcPr>
-            <w:tcW w:type="dxa" w:w="1074"/>
-            <w:vAlign w:val="center"/>
-            <w:shd w:val="clear" w:color="auto" w:fill="F2F5F9"/>
-          </w:tcPr>
-          <w:p>
-            <w:pPr>
-              <w:spacing w:after="0" w:line="240" w:lineRule="auto"/>
-              <w:jc w:val="left"/>
-            </w:pPr>
-            <w:r>
-              <w:rPr>
-                <w:rFonts w:ascii="Cambria" w:hAnsi="Cambria" w:eastAsia="Cambria"/>
-                <w:b w:val="0"/>
-                <w:i w:val="0"/>
-                <w:color w:val="222222"/>
-                <w:sz w:val="16"/>
-              </w:rPr>
-              <w:t>56</w:t>
-            </w:r>
-          </w:p>
-        </w:tc>
-        <w:tc>
-          <w:tcPr>
-            <w:tcW w:type="dxa" w:w="1288"/>
-            <w:vAlign w:val="center"/>
-            <w:shd w:val="clear" w:color="auto" w:fill="F2F5F9"/>
-          </w:tcPr>
-          <w:p>
-            <w:pPr>
-              <w:spacing w:after="0" w:line="240" w:lineRule="auto"/>
-              <w:jc w:val="left"/>
-            </w:pPr>
-            <w:r>
-              <w:rPr>
-                <w:rFonts w:ascii="Cambria" w:hAnsi="Cambria" w:eastAsia="Cambria"/>
-                <w:b w:val="0"/>
-                <w:i w:val="0"/>
-                <w:color w:val="222222"/>
-                <w:sz w:val="16"/>
-              </w:rPr>
-              <w:t>56</w:t>
+              <w:t>118</w:t>
             </w:r>
           </w:p>
         </w:tc>
@@ -3846,7 +3696,7 @@
           <w:color w:val="222222"/>
           <w:sz w:val="20"/>
         </w:rPr>
-        <w:t xml:space="preserve"> 2,073,600 rows; 4,244 missing values; 0 duplicate rows; 133 features; 14-day windows; stride 3 days. The theft consumers are 36 of 240 (15%). The total theft-window count and ratio are arithmetic sums over the three splits.</w:t>
+        <w:t xml:space="preserve"> 2,073,600 rows; 20,802 missing values; 0 duplicate rows; 133 features; 14-day windows; stride 3 days. The theft consumers are 36 of 240 (15%). The total theft-window count and ratio are arithmetic sums over the three splits.</w:t>
       </w:r>
     </w:p>
     <w:p>
@@ -4139,7 +3989,7 @@
                 <w:color w:val="222222"/>
                 <w:sz w:val="16"/>
               </w:rPr>
-              <w:t>36</w:t>
+              <w:t>7</w:t>
             </w:r>
           </w:p>
         </w:tc>
@@ -4161,7 +4011,7 @@
                 <w:color w:val="222222"/>
                 <w:sz w:val="16"/>
               </w:rPr>
-              <w:t>2,016</w:t>
+              <w:t>826</w:t>
             </w:r>
           </w:p>
         </w:tc>
@@ -4183,7 +4033,7 @@
                 <w:color w:val="222222"/>
                 <w:sz w:val="16"/>
               </w:rPr>
-              <w:t>346</w:t>
+              <w:t>0</w:t>
             </w:r>
           </w:p>
         </w:tc>
@@ -4205,7 +4055,7 @@
                 <w:color w:val="222222"/>
                 <w:sz w:val="16"/>
               </w:rPr>
-              <w:t>17.16%</w:t>
+              <w:t>0.00%</w:t>
             </w:r>
           </w:p>
         </w:tc>
@@ -4227,7 +4077,7 @@
                 <w:color w:val="222222"/>
                 <w:sz w:val="16"/>
               </w:rPr>
-              <w:t>1,714</w:t>
+              <w:t>702</w:t>
             </w:r>
           </w:p>
         </w:tc>
@@ -4249,7 +4099,7 @@
                 <w:color w:val="222222"/>
                 <w:sz w:val="16"/>
               </w:rPr>
-              <w:t>302</w:t>
+              <w:t>124</w:t>
             </w:r>
           </w:p>
         </w:tc>
@@ -4300,7 +4150,7 @@
                 <w:color w:val="222222"/>
                 <w:sz w:val="16"/>
               </w:rPr>
-              <w:t>65</w:t>
+              <w:t>23</w:t>
             </w:r>
           </w:p>
         </w:tc>
@@ -4323,7 +4173,7 @@
                 <w:color w:val="222222"/>
                 <w:sz w:val="16"/>
               </w:rPr>
-              <w:t>3,640</w:t>
+              <w:t>2,714</w:t>
             </w:r>
           </w:p>
         </w:tc>
@@ -4346,7 +4196,7 @@
                 <w:color w:val="222222"/>
                 <w:sz w:val="16"/>
               </w:rPr>
-              <w:t>329</w:t>
+              <w:t>151</w:t>
             </w:r>
           </w:p>
         </w:tc>
@@ -4369,7 +4219,7 @@
                 <w:color w:val="222222"/>
                 <w:sz w:val="16"/>
               </w:rPr>
-              <w:t>9.04%</w:t>
+              <w:t>5.56%</w:t>
             </w:r>
           </w:p>
         </w:tc>
@@ -4392,7 +4242,7 @@
                 <w:color w:val="222222"/>
                 <w:sz w:val="16"/>
               </w:rPr>
-              <w:t>3,094</w:t>
+              <w:t>2,307</w:t>
             </w:r>
           </w:p>
         </w:tc>
@@ -4415,7 +4265,7 @@
                 <w:color w:val="222222"/>
                 <w:sz w:val="16"/>
               </w:rPr>
-              <w:t>546</w:t>
+              <w:t>407</w:t>
             </w:r>
           </w:p>
         </w:tc>
@@ -4464,7 +4314,7 @@
                 <w:color w:val="222222"/>
                 <w:sz w:val="16"/>
               </w:rPr>
-              <w:t>6</w:t>
+              <w:t>14</w:t>
             </w:r>
           </w:p>
         </w:tc>
@@ -4486,7 +4336,7 @@
                 <w:color w:val="222222"/>
                 <w:sz w:val="16"/>
               </w:rPr>
-              <w:t>336</w:t>
+              <w:t>1,652</w:t>
             </w:r>
           </w:p>
         </w:tc>
@@ -4508,7 +4358,7 @@
                 <w:color w:val="222222"/>
                 <w:sz w:val="16"/>
               </w:rPr>
-              <w:t>18</w:t>
+              <w:t>117</w:t>
             </w:r>
           </w:p>
         </w:tc>
@@ -4530,7 +4380,7 @@
                 <w:color w:val="222222"/>
                 <w:sz w:val="16"/>
               </w:rPr>
-              <w:t>5.36%</w:t>
+              <w:t>7.08%</w:t>
             </w:r>
           </w:p>
         </w:tc>
@@ -4552,7 +4402,7 @@
                 <w:color w:val="222222"/>
                 <w:sz w:val="16"/>
               </w:rPr>
-              <w:t>286</w:t>
+              <w:t>1,404</w:t>
             </w:r>
           </w:p>
         </w:tc>
@@ -4574,7 +4424,7 @@
                 <w:color w:val="222222"/>
                 <w:sz w:val="16"/>
               </w:rPr>
-              <w:t>50</w:t>
+              <w:t>248</w:t>
             </w:r>
           </w:p>
         </w:tc>
@@ -4625,7 +4475,7 @@
                 <w:color w:val="222222"/>
                 <w:sz w:val="16"/>
               </w:rPr>
-              <w:t>43</w:t>
+              <w:t>7</w:t>
             </w:r>
           </w:p>
         </w:tc>
@@ -4648,7 +4498,7 @@
                 <w:color w:val="222222"/>
                 <w:sz w:val="16"/>
               </w:rPr>
-              <w:t>2,408</w:t>
+              <w:t>826</w:t>
             </w:r>
           </w:p>
         </w:tc>
@@ -4671,7 +4521,7 @@
                 <w:color w:val="222222"/>
                 <w:sz w:val="16"/>
               </w:rPr>
-              <w:t>0</w:t>
+              <w:t>206</w:t>
             </w:r>
           </w:p>
         </w:tc>
@@ -4694,7 +4544,7 @@
                 <w:color w:val="222222"/>
                 <w:sz w:val="16"/>
               </w:rPr>
-              <w:t>0.00%</w:t>
+              <w:t>24.94%</w:t>
             </w:r>
           </w:p>
         </w:tc>
@@ -4717,7 +4567,7 @@
                 <w:color w:val="222222"/>
                 <w:sz w:val="16"/>
               </w:rPr>
-              <w:t>2,047</w:t>
+              <w:t>702</w:t>
             </w:r>
           </w:p>
         </w:tc>
@@ -4740,7 +4590,7 @@
                 <w:color w:val="222222"/>
                 <w:sz w:val="16"/>
               </w:rPr>
-              <w:t>361</w:t>
+              <w:t>124</w:t>
             </w:r>
           </w:p>
         </w:tc>
@@ -4789,7 +4639,7 @@
                 <w:color w:val="222222"/>
                 <w:sz w:val="16"/>
               </w:rPr>
-              <w:t>6</w:t>
+              <w:t>104</w:t>
             </w:r>
           </w:p>
         </w:tc>
@@ -4811,7 +4661,7 @@
                 <w:color w:val="222222"/>
                 <w:sz w:val="16"/>
               </w:rPr>
-              <w:t>336</w:t>
+              <w:t>12,272</w:t>
             </w:r>
           </w:p>
         </w:tc>
@@ -4833,7 +4683,7 @@
                 <w:color w:val="222222"/>
                 <w:sz w:val="16"/>
               </w:rPr>
-              <w:t>13</w:t>
+              <w:t>312</w:t>
             </w:r>
           </w:p>
         </w:tc>
@@ -4855,7 +4705,7 @@
                 <w:color w:val="222222"/>
                 <w:sz w:val="16"/>
               </w:rPr>
-              <w:t>3.87%</w:t>
+              <w:t>2.54%</w:t>
             </w:r>
           </w:p>
         </w:tc>
@@ -4877,7 +4727,7 @@
                 <w:color w:val="222222"/>
                 <w:sz w:val="16"/>
               </w:rPr>
-              <w:t>286</w:t>
+              <w:t>10,431</w:t>
             </w:r>
           </w:p>
         </w:tc>
@@ -4899,7 +4749,7 @@
                 <w:color w:val="222222"/>
                 <w:sz w:val="16"/>
               </w:rPr>
-              <w:t>50</w:t>
+              <w:t>1,841</w:t>
             </w:r>
           </w:p>
         </w:tc>
@@ -4922,6 +4772,821 @@
             <w:r>
               <w:rPr>
                 <w:rFonts w:ascii="Cambria" w:hAnsi="Cambria" w:eastAsia="Cambria"/>
+                <w:b w:val="0"/>
+                <w:i w:val="0"/>
+                <w:color w:val="222222"/>
+                <w:sz w:val="16"/>
+              </w:rPr>
+              <w:t>client_05</w:t>
+            </w:r>
+          </w:p>
+        </w:tc>
+        <w:tc>
+          <w:tcPr>
+            <w:tcW w:type="dxa" w:w="1046"/>
+            <w:vAlign w:val="center"/>
+            <w:shd w:val="clear" w:color="auto" w:fill="F2F5F9"/>
+          </w:tcPr>
+          <w:p>
+            <w:pPr>
+              <w:spacing w:after="0" w:line="240" w:lineRule="auto"/>
+              <w:jc w:val="center"/>
+            </w:pPr>
+            <w:r>
+              <w:rPr>
+                <w:rFonts w:ascii="Cambria" w:hAnsi="Cambria" w:eastAsia="Cambria"/>
+                <w:b w:val="0"/>
+                <w:i w:val="0"/>
+                <w:color w:val="222222"/>
+                <w:sz w:val="16"/>
+              </w:rPr>
+              <w:t>7</w:t>
+            </w:r>
+          </w:p>
+        </w:tc>
+        <w:tc>
+          <w:tcPr>
+            <w:tcW w:type="dxa" w:w="1859"/>
+            <w:vAlign w:val="center"/>
+            <w:shd w:val="clear" w:color="auto" w:fill="F2F5F9"/>
+          </w:tcPr>
+          <w:p>
+            <w:pPr>
+              <w:spacing w:after="0" w:line="240" w:lineRule="auto"/>
+              <w:jc w:val="center"/>
+            </w:pPr>
+            <w:r>
+              <w:rPr>
+                <w:rFonts w:ascii="Cambria" w:hAnsi="Cambria" w:eastAsia="Cambria"/>
+                <w:b w:val="0"/>
+                <w:i w:val="0"/>
+                <w:color w:val="222222"/>
+                <w:sz w:val="16"/>
+              </w:rPr>
+              <w:t>826</w:t>
+            </w:r>
+          </w:p>
+        </w:tc>
+        <w:tc>
+          <w:tcPr>
+            <w:tcW w:type="dxa" w:w="1511"/>
+            <w:vAlign w:val="center"/>
+            <w:shd w:val="clear" w:color="auto" w:fill="F2F5F9"/>
+          </w:tcPr>
+          <w:p>
+            <w:pPr>
+              <w:spacing w:after="0" w:line="240" w:lineRule="auto"/>
+              <w:jc w:val="center"/>
+            </w:pPr>
+            <w:r>
+              <w:rPr>
+                <w:rFonts w:ascii="Cambria" w:hAnsi="Cambria" w:eastAsia="Cambria"/>
+                <w:b w:val="0"/>
+                <w:i w:val="0"/>
+                <w:color w:val="222222"/>
+                <w:sz w:val="16"/>
+              </w:rPr>
+              <w:t>69</w:t>
+            </w:r>
+          </w:p>
+        </w:tc>
+        <w:tc>
+          <w:tcPr>
+            <w:tcW w:type="dxa" w:w="1278"/>
+            <w:vAlign w:val="center"/>
+            <w:shd w:val="clear" w:color="auto" w:fill="F2F5F9"/>
+          </w:tcPr>
+          <w:p>
+            <w:pPr>
+              <w:spacing w:after="0" w:line="240" w:lineRule="auto"/>
+              <w:jc w:val="center"/>
+            </w:pPr>
+            <w:r>
+              <w:rPr>
+                <w:rFonts w:ascii="Cambria" w:hAnsi="Cambria" w:eastAsia="Cambria"/>
+                <w:b w:val="0"/>
+                <w:i w:val="0"/>
+                <w:color w:val="222222"/>
+                <w:sz w:val="16"/>
+              </w:rPr>
+              <w:t>8.35%</w:t>
+            </w:r>
+          </w:p>
+        </w:tc>
+        <w:tc>
+          <w:tcPr>
+            <w:tcW w:type="dxa" w:w="1278"/>
+            <w:vAlign w:val="center"/>
+            <w:shd w:val="clear" w:color="auto" w:fill="F2F5F9"/>
+          </w:tcPr>
+          <w:p>
+            <w:pPr>
+              <w:spacing w:after="0" w:line="240" w:lineRule="auto"/>
+              <w:jc w:val="center"/>
+            </w:pPr>
+            <w:r>
+              <w:rPr>
+                <w:rFonts w:ascii="Cambria" w:hAnsi="Cambria" w:eastAsia="Cambria"/>
+                <w:b w:val="0"/>
+                <w:i w:val="0"/>
+                <w:color w:val="222222"/>
+                <w:sz w:val="16"/>
+              </w:rPr>
+              <w:t>702</w:t>
+            </w:r>
+          </w:p>
+        </w:tc>
+        <w:tc>
+          <w:tcPr>
+            <w:tcW w:type="dxa" w:w="1859"/>
+            <w:vAlign w:val="center"/>
+            <w:shd w:val="clear" w:color="auto" w:fill="F2F5F9"/>
+          </w:tcPr>
+          <w:p>
+            <w:pPr>
+              <w:spacing w:after="0" w:line="240" w:lineRule="auto"/>
+              <w:jc w:val="center"/>
+            </w:pPr>
+            <w:r>
+              <w:rPr>
+                <w:rFonts w:ascii="Cambria" w:hAnsi="Cambria" w:eastAsia="Cambria"/>
+                <w:b w:val="0"/>
+                <w:i w:val="0"/>
+                <w:color w:val="222222"/>
+                <w:sz w:val="16"/>
+              </w:rPr>
+              <w:t>124</w:t>
+            </w:r>
+          </w:p>
+        </w:tc>
+      </w:tr>
+      <w:tr>
+        <w:trPr>
+          <w:cantSplit/>
+        </w:trPr>
+        <w:tc>
+          <w:tcPr>
+            <w:tcW w:type="dxa" w:w="1046"/>
+            <w:vAlign w:val="center"/>
+          </w:tcPr>
+          <w:p>
+            <w:pPr>
+              <w:spacing w:after="0" w:line="240" w:lineRule="auto"/>
+              <w:jc w:val="left"/>
+            </w:pPr>
+            <w:r>
+              <w:rPr>
+                <w:rFonts w:ascii="Cambria" w:hAnsi="Cambria" w:eastAsia="Cambria"/>
+                <w:b w:val="0"/>
+                <w:i w:val="0"/>
+                <w:color w:val="222222"/>
+                <w:sz w:val="16"/>
+              </w:rPr>
+              <w:t>client_06</w:t>
+            </w:r>
+          </w:p>
+        </w:tc>
+        <w:tc>
+          <w:tcPr>
+            <w:tcW w:type="dxa" w:w="1046"/>
+            <w:vAlign w:val="center"/>
+          </w:tcPr>
+          <w:p>
+            <w:pPr>
+              <w:spacing w:after="0" w:line="240" w:lineRule="auto"/>
+              <w:jc w:val="center"/>
+            </w:pPr>
+            <w:r>
+              <w:rPr>
+                <w:rFonts w:ascii="Cambria" w:hAnsi="Cambria" w:eastAsia="Cambria"/>
+                <w:b w:val="0"/>
+                <w:i w:val="0"/>
+                <w:color w:val="222222"/>
+                <w:sz w:val="16"/>
+              </w:rPr>
+              <w:t>7</w:t>
+            </w:r>
+          </w:p>
+        </w:tc>
+        <w:tc>
+          <w:tcPr>
+            <w:tcW w:type="dxa" w:w="1859"/>
+            <w:vAlign w:val="center"/>
+          </w:tcPr>
+          <w:p>
+            <w:pPr>
+              <w:spacing w:after="0" w:line="240" w:lineRule="auto"/>
+              <w:jc w:val="center"/>
+            </w:pPr>
+            <w:r>
+              <w:rPr>
+                <w:rFonts w:ascii="Cambria" w:hAnsi="Cambria" w:eastAsia="Cambria"/>
+                <w:b w:val="0"/>
+                <w:i w:val="0"/>
+                <w:color w:val="222222"/>
+                <w:sz w:val="16"/>
+              </w:rPr>
+              <w:t>826</w:t>
+            </w:r>
+          </w:p>
+        </w:tc>
+        <w:tc>
+          <w:tcPr>
+            <w:tcW w:type="dxa" w:w="1511"/>
+            <w:vAlign w:val="center"/>
+          </w:tcPr>
+          <w:p>
+            <w:pPr>
+              <w:spacing w:after="0" w:line="240" w:lineRule="auto"/>
+              <w:jc w:val="center"/>
+            </w:pPr>
+            <w:r>
+              <w:rPr>
+                <w:rFonts w:ascii="Cambria" w:hAnsi="Cambria" w:eastAsia="Cambria"/>
+                <w:b w:val="0"/>
+                <w:i w:val="0"/>
+                <w:color w:val="222222"/>
+                <w:sz w:val="16"/>
+              </w:rPr>
+              <w:t>88</w:t>
+            </w:r>
+          </w:p>
+        </w:tc>
+        <w:tc>
+          <w:tcPr>
+            <w:tcW w:type="dxa" w:w="1278"/>
+            <w:vAlign w:val="center"/>
+          </w:tcPr>
+          <w:p>
+            <w:pPr>
+              <w:spacing w:after="0" w:line="240" w:lineRule="auto"/>
+              <w:jc w:val="center"/>
+            </w:pPr>
+            <w:r>
+              <w:rPr>
+                <w:rFonts w:ascii="Cambria" w:hAnsi="Cambria" w:eastAsia="Cambria"/>
+                <w:b w:val="0"/>
+                <w:i w:val="0"/>
+                <w:color w:val="222222"/>
+                <w:sz w:val="16"/>
+              </w:rPr>
+              <w:t>10.65%</w:t>
+            </w:r>
+          </w:p>
+        </w:tc>
+        <w:tc>
+          <w:tcPr>
+            <w:tcW w:type="dxa" w:w="1278"/>
+            <w:vAlign w:val="center"/>
+          </w:tcPr>
+          <w:p>
+            <w:pPr>
+              <w:spacing w:after="0" w:line="240" w:lineRule="auto"/>
+              <w:jc w:val="center"/>
+            </w:pPr>
+            <w:r>
+              <w:rPr>
+                <w:rFonts w:ascii="Cambria" w:hAnsi="Cambria" w:eastAsia="Cambria"/>
+                <w:b w:val="0"/>
+                <w:i w:val="0"/>
+                <w:color w:val="222222"/>
+                <w:sz w:val="16"/>
+              </w:rPr>
+              <w:t>702</w:t>
+            </w:r>
+          </w:p>
+        </w:tc>
+        <w:tc>
+          <w:tcPr>
+            <w:tcW w:type="dxa" w:w="1859"/>
+            <w:vAlign w:val="center"/>
+          </w:tcPr>
+          <w:p>
+            <w:pPr>
+              <w:spacing w:after="0" w:line="240" w:lineRule="auto"/>
+              <w:jc w:val="center"/>
+            </w:pPr>
+            <w:r>
+              <w:rPr>
+                <w:rFonts w:ascii="Cambria" w:hAnsi="Cambria" w:eastAsia="Cambria"/>
+                <w:b w:val="0"/>
+                <w:i w:val="0"/>
+                <w:color w:val="222222"/>
+                <w:sz w:val="16"/>
+              </w:rPr>
+              <w:t>124</w:t>
+            </w:r>
+          </w:p>
+        </w:tc>
+      </w:tr>
+      <w:tr>
+        <w:trPr>
+          <w:cantSplit/>
+        </w:trPr>
+        <w:tc>
+          <w:tcPr>
+            <w:tcW w:type="dxa" w:w="1046"/>
+            <w:vAlign w:val="center"/>
+            <w:shd w:val="clear" w:color="auto" w:fill="F2F5F9"/>
+          </w:tcPr>
+          <w:p>
+            <w:pPr>
+              <w:spacing w:after="0" w:line="240" w:lineRule="auto"/>
+              <w:jc w:val="left"/>
+            </w:pPr>
+            <w:r>
+              <w:rPr>
+                <w:rFonts w:ascii="Cambria" w:hAnsi="Cambria" w:eastAsia="Cambria"/>
+                <w:b w:val="0"/>
+                <w:i w:val="0"/>
+                <w:color w:val="222222"/>
+                <w:sz w:val="16"/>
+              </w:rPr>
+              <w:t>client_07</w:t>
+            </w:r>
+          </w:p>
+        </w:tc>
+        <w:tc>
+          <w:tcPr>
+            <w:tcW w:type="dxa" w:w="1046"/>
+            <w:vAlign w:val="center"/>
+            <w:shd w:val="clear" w:color="auto" w:fill="F2F5F9"/>
+          </w:tcPr>
+          <w:p>
+            <w:pPr>
+              <w:spacing w:after="0" w:line="240" w:lineRule="auto"/>
+              <w:jc w:val="center"/>
+            </w:pPr>
+            <w:r>
+              <w:rPr>
+                <w:rFonts w:ascii="Cambria" w:hAnsi="Cambria" w:eastAsia="Cambria"/>
+                <w:b w:val="0"/>
+                <w:i w:val="0"/>
+                <w:color w:val="222222"/>
+                <w:sz w:val="16"/>
+              </w:rPr>
+              <w:t>7</w:t>
+            </w:r>
+          </w:p>
+        </w:tc>
+        <w:tc>
+          <w:tcPr>
+            <w:tcW w:type="dxa" w:w="1859"/>
+            <w:vAlign w:val="center"/>
+            <w:shd w:val="clear" w:color="auto" w:fill="F2F5F9"/>
+          </w:tcPr>
+          <w:p>
+            <w:pPr>
+              <w:spacing w:after="0" w:line="240" w:lineRule="auto"/>
+              <w:jc w:val="center"/>
+            </w:pPr>
+            <w:r>
+              <w:rPr>
+                <w:rFonts w:ascii="Cambria" w:hAnsi="Cambria" w:eastAsia="Cambria"/>
+                <w:b w:val="0"/>
+                <w:i w:val="0"/>
+                <w:color w:val="222222"/>
+                <w:sz w:val="16"/>
+              </w:rPr>
+              <w:t>826</w:t>
+            </w:r>
+          </w:p>
+        </w:tc>
+        <w:tc>
+          <w:tcPr>
+            <w:tcW w:type="dxa" w:w="1511"/>
+            <w:vAlign w:val="center"/>
+            <w:shd w:val="clear" w:color="auto" w:fill="F2F5F9"/>
+          </w:tcPr>
+          <w:p>
+            <w:pPr>
+              <w:spacing w:after="0" w:line="240" w:lineRule="auto"/>
+              <w:jc w:val="center"/>
+            </w:pPr>
+            <w:r>
+              <w:rPr>
+                <w:rFonts w:ascii="Cambria" w:hAnsi="Cambria" w:eastAsia="Cambria"/>
+                <w:b w:val="0"/>
+                <w:i w:val="0"/>
+                <w:color w:val="222222"/>
+                <w:sz w:val="16"/>
+              </w:rPr>
+              <w:t>37</w:t>
+            </w:r>
+          </w:p>
+        </w:tc>
+        <w:tc>
+          <w:tcPr>
+            <w:tcW w:type="dxa" w:w="1278"/>
+            <w:vAlign w:val="center"/>
+            <w:shd w:val="clear" w:color="auto" w:fill="F2F5F9"/>
+          </w:tcPr>
+          <w:p>
+            <w:pPr>
+              <w:spacing w:after="0" w:line="240" w:lineRule="auto"/>
+              <w:jc w:val="center"/>
+            </w:pPr>
+            <w:r>
+              <w:rPr>
+                <w:rFonts w:ascii="Cambria" w:hAnsi="Cambria" w:eastAsia="Cambria"/>
+                <w:b w:val="0"/>
+                <w:i w:val="0"/>
+                <w:color w:val="222222"/>
+                <w:sz w:val="16"/>
+              </w:rPr>
+              <w:t>4.48%</w:t>
+            </w:r>
+          </w:p>
+        </w:tc>
+        <w:tc>
+          <w:tcPr>
+            <w:tcW w:type="dxa" w:w="1278"/>
+            <w:vAlign w:val="center"/>
+            <w:shd w:val="clear" w:color="auto" w:fill="F2F5F9"/>
+          </w:tcPr>
+          <w:p>
+            <w:pPr>
+              <w:spacing w:after="0" w:line="240" w:lineRule="auto"/>
+              <w:jc w:val="center"/>
+            </w:pPr>
+            <w:r>
+              <w:rPr>
+                <w:rFonts w:ascii="Cambria" w:hAnsi="Cambria" w:eastAsia="Cambria"/>
+                <w:b w:val="0"/>
+                <w:i w:val="0"/>
+                <w:color w:val="222222"/>
+                <w:sz w:val="16"/>
+              </w:rPr>
+              <w:t>702</w:t>
+            </w:r>
+          </w:p>
+        </w:tc>
+        <w:tc>
+          <w:tcPr>
+            <w:tcW w:type="dxa" w:w="1859"/>
+            <w:vAlign w:val="center"/>
+            <w:shd w:val="clear" w:color="auto" w:fill="F2F5F9"/>
+          </w:tcPr>
+          <w:p>
+            <w:pPr>
+              <w:spacing w:after="0" w:line="240" w:lineRule="auto"/>
+              <w:jc w:val="center"/>
+            </w:pPr>
+            <w:r>
+              <w:rPr>
+                <w:rFonts w:ascii="Cambria" w:hAnsi="Cambria" w:eastAsia="Cambria"/>
+                <w:b w:val="0"/>
+                <w:i w:val="0"/>
+                <w:color w:val="222222"/>
+                <w:sz w:val="16"/>
+              </w:rPr>
+              <w:t>124</w:t>
+            </w:r>
+          </w:p>
+        </w:tc>
+      </w:tr>
+      <w:tr>
+        <w:trPr>
+          <w:cantSplit/>
+        </w:trPr>
+        <w:tc>
+          <w:tcPr>
+            <w:tcW w:type="dxa" w:w="1046"/>
+            <w:vAlign w:val="center"/>
+          </w:tcPr>
+          <w:p>
+            <w:pPr>
+              <w:spacing w:after="0" w:line="240" w:lineRule="auto"/>
+              <w:jc w:val="left"/>
+            </w:pPr>
+            <w:r>
+              <w:rPr>
+                <w:rFonts w:ascii="Cambria" w:hAnsi="Cambria" w:eastAsia="Cambria"/>
+                <w:b w:val="0"/>
+                <w:i w:val="0"/>
+                <w:color w:val="222222"/>
+                <w:sz w:val="16"/>
+              </w:rPr>
+              <w:t>client_08</w:t>
+            </w:r>
+          </w:p>
+        </w:tc>
+        <w:tc>
+          <w:tcPr>
+            <w:tcW w:type="dxa" w:w="1046"/>
+            <w:vAlign w:val="center"/>
+          </w:tcPr>
+          <w:p>
+            <w:pPr>
+              <w:spacing w:after="0" w:line="240" w:lineRule="auto"/>
+              <w:jc w:val="center"/>
+            </w:pPr>
+            <w:r>
+              <w:rPr>
+                <w:rFonts w:ascii="Cambria" w:hAnsi="Cambria" w:eastAsia="Cambria"/>
+                <w:b w:val="0"/>
+                <w:i w:val="0"/>
+                <w:color w:val="222222"/>
+                <w:sz w:val="16"/>
+              </w:rPr>
+              <w:t>207</w:t>
+            </w:r>
+          </w:p>
+        </w:tc>
+        <w:tc>
+          <w:tcPr>
+            <w:tcW w:type="dxa" w:w="1859"/>
+            <w:vAlign w:val="center"/>
+          </w:tcPr>
+          <w:p>
+            <w:pPr>
+              <w:spacing w:after="0" w:line="240" w:lineRule="auto"/>
+              <w:jc w:val="center"/>
+            </w:pPr>
+            <w:r>
+              <w:rPr>
+                <w:rFonts w:ascii="Cambria" w:hAnsi="Cambria" w:eastAsia="Cambria"/>
+                <w:b w:val="0"/>
+                <w:i w:val="0"/>
+                <w:color w:val="222222"/>
+                <w:sz w:val="16"/>
+              </w:rPr>
+              <w:t>24,426</w:t>
+            </w:r>
+          </w:p>
+        </w:tc>
+        <w:tc>
+          <w:tcPr>
+            <w:tcW w:type="dxa" w:w="1511"/>
+            <w:vAlign w:val="center"/>
+          </w:tcPr>
+          <w:p>
+            <w:pPr>
+              <w:spacing w:after="0" w:line="240" w:lineRule="auto"/>
+              <w:jc w:val="center"/>
+            </w:pPr>
+            <w:r>
+              <w:rPr>
+                <w:rFonts w:ascii="Cambria" w:hAnsi="Cambria" w:eastAsia="Cambria"/>
+                <w:b w:val="0"/>
+                <w:i w:val="0"/>
+                <w:color w:val="222222"/>
+                <w:sz w:val="16"/>
+              </w:rPr>
+              <w:t>1,756</w:t>
+            </w:r>
+          </w:p>
+        </w:tc>
+        <w:tc>
+          <w:tcPr>
+            <w:tcW w:type="dxa" w:w="1278"/>
+            <w:vAlign w:val="center"/>
+          </w:tcPr>
+          <w:p>
+            <w:pPr>
+              <w:spacing w:after="0" w:line="240" w:lineRule="auto"/>
+              <w:jc w:val="center"/>
+            </w:pPr>
+            <w:r>
+              <w:rPr>
+                <w:rFonts w:ascii="Cambria" w:hAnsi="Cambria" w:eastAsia="Cambria"/>
+                <w:b w:val="0"/>
+                <w:i w:val="0"/>
+                <w:color w:val="222222"/>
+                <w:sz w:val="16"/>
+              </w:rPr>
+              <w:t>7.19%</w:t>
+            </w:r>
+          </w:p>
+        </w:tc>
+        <w:tc>
+          <w:tcPr>
+            <w:tcW w:type="dxa" w:w="1278"/>
+            <w:vAlign w:val="center"/>
+          </w:tcPr>
+          <w:p>
+            <w:pPr>
+              <w:spacing w:after="0" w:line="240" w:lineRule="auto"/>
+              <w:jc w:val="center"/>
+            </w:pPr>
+            <w:r>
+              <w:rPr>
+                <w:rFonts w:ascii="Cambria" w:hAnsi="Cambria" w:eastAsia="Cambria"/>
+                <w:b w:val="0"/>
+                <w:i w:val="0"/>
+                <w:color w:val="222222"/>
+                <w:sz w:val="16"/>
+              </w:rPr>
+              <w:t>20,762</w:t>
+            </w:r>
+          </w:p>
+        </w:tc>
+        <w:tc>
+          <w:tcPr>
+            <w:tcW w:type="dxa" w:w="1859"/>
+            <w:vAlign w:val="center"/>
+          </w:tcPr>
+          <w:p>
+            <w:pPr>
+              <w:spacing w:after="0" w:line="240" w:lineRule="auto"/>
+              <w:jc w:val="center"/>
+            </w:pPr>
+            <w:r>
+              <w:rPr>
+                <w:rFonts w:ascii="Cambria" w:hAnsi="Cambria" w:eastAsia="Cambria"/>
+                <w:b w:val="0"/>
+                <w:i w:val="0"/>
+                <w:color w:val="222222"/>
+                <w:sz w:val="16"/>
+              </w:rPr>
+              <w:t>3,664</w:t>
+            </w:r>
+          </w:p>
+        </w:tc>
+      </w:tr>
+      <w:tr>
+        <w:trPr>
+          <w:cantSplit/>
+        </w:trPr>
+        <w:tc>
+          <w:tcPr>
+            <w:tcW w:type="dxa" w:w="1046"/>
+            <w:vAlign w:val="center"/>
+            <w:shd w:val="clear" w:color="auto" w:fill="F2F5F9"/>
+          </w:tcPr>
+          <w:p>
+            <w:pPr>
+              <w:spacing w:after="0" w:line="240" w:lineRule="auto"/>
+              <w:jc w:val="left"/>
+            </w:pPr>
+            <w:r>
+              <w:rPr>
+                <w:rFonts w:ascii="Cambria" w:hAnsi="Cambria" w:eastAsia="Cambria"/>
+                <w:b w:val="0"/>
+                <w:i w:val="0"/>
+                <w:color w:val="222222"/>
+                <w:sz w:val="16"/>
+              </w:rPr>
+              <w:t>client_09</w:t>
+            </w:r>
+          </w:p>
+        </w:tc>
+        <w:tc>
+          <w:tcPr>
+            <w:tcW w:type="dxa" w:w="1046"/>
+            <w:vAlign w:val="center"/>
+            <w:shd w:val="clear" w:color="auto" w:fill="F2F5F9"/>
+          </w:tcPr>
+          <w:p>
+            <w:pPr>
+              <w:spacing w:after="0" w:line="240" w:lineRule="auto"/>
+              <w:jc w:val="center"/>
+            </w:pPr>
+            <w:r>
+              <w:rPr>
+                <w:rFonts w:ascii="Cambria" w:hAnsi="Cambria" w:eastAsia="Cambria"/>
+                <w:b w:val="0"/>
+                <w:i w:val="0"/>
+                <w:color w:val="222222"/>
+                <w:sz w:val="16"/>
+              </w:rPr>
+              <w:t>7</w:t>
+            </w:r>
+          </w:p>
+        </w:tc>
+        <w:tc>
+          <w:tcPr>
+            <w:tcW w:type="dxa" w:w="1859"/>
+            <w:vAlign w:val="center"/>
+            <w:shd w:val="clear" w:color="auto" w:fill="F2F5F9"/>
+          </w:tcPr>
+          <w:p>
+            <w:pPr>
+              <w:spacing w:after="0" w:line="240" w:lineRule="auto"/>
+              <w:jc w:val="center"/>
+            </w:pPr>
+            <w:r>
+              <w:rPr>
+                <w:rFonts w:ascii="Cambria" w:hAnsi="Cambria" w:eastAsia="Cambria"/>
+                <w:b w:val="0"/>
+                <w:i w:val="0"/>
+                <w:color w:val="222222"/>
+                <w:sz w:val="16"/>
+              </w:rPr>
+              <w:t>826</w:t>
+            </w:r>
+          </w:p>
+        </w:tc>
+        <w:tc>
+          <w:tcPr>
+            <w:tcW w:type="dxa" w:w="1511"/>
+            <w:vAlign w:val="center"/>
+            <w:shd w:val="clear" w:color="auto" w:fill="F2F5F9"/>
+          </w:tcPr>
+          <w:p>
+            <w:pPr>
+              <w:spacing w:after="0" w:line="240" w:lineRule="auto"/>
+              <w:jc w:val="center"/>
+            </w:pPr>
+            <w:r>
+              <w:rPr>
+                <w:rFonts w:ascii="Cambria" w:hAnsi="Cambria" w:eastAsia="Cambria"/>
+                <w:b w:val="0"/>
+                <w:i w:val="0"/>
+                <w:color w:val="222222"/>
+                <w:sz w:val="16"/>
+              </w:rPr>
+              <w:t>25</w:t>
+            </w:r>
+          </w:p>
+        </w:tc>
+        <w:tc>
+          <w:tcPr>
+            <w:tcW w:type="dxa" w:w="1278"/>
+            <w:vAlign w:val="center"/>
+            <w:shd w:val="clear" w:color="auto" w:fill="F2F5F9"/>
+          </w:tcPr>
+          <w:p>
+            <w:pPr>
+              <w:spacing w:after="0" w:line="240" w:lineRule="auto"/>
+              <w:jc w:val="center"/>
+            </w:pPr>
+            <w:r>
+              <w:rPr>
+                <w:rFonts w:ascii="Cambria" w:hAnsi="Cambria" w:eastAsia="Cambria"/>
+                <w:b w:val="0"/>
+                <w:i w:val="0"/>
+                <w:color w:val="222222"/>
+                <w:sz w:val="16"/>
+              </w:rPr>
+              <w:t>3.03%</w:t>
+            </w:r>
+          </w:p>
+        </w:tc>
+        <w:tc>
+          <w:tcPr>
+            <w:tcW w:type="dxa" w:w="1278"/>
+            <w:vAlign w:val="center"/>
+            <w:shd w:val="clear" w:color="auto" w:fill="F2F5F9"/>
+          </w:tcPr>
+          <w:p>
+            <w:pPr>
+              <w:spacing w:after="0" w:line="240" w:lineRule="auto"/>
+              <w:jc w:val="center"/>
+            </w:pPr>
+            <w:r>
+              <w:rPr>
+                <w:rFonts w:ascii="Cambria" w:hAnsi="Cambria" w:eastAsia="Cambria"/>
+                <w:b w:val="0"/>
+                <w:i w:val="0"/>
+                <w:color w:val="222222"/>
+                <w:sz w:val="16"/>
+              </w:rPr>
+              <w:t>702</w:t>
+            </w:r>
+          </w:p>
+        </w:tc>
+        <w:tc>
+          <w:tcPr>
+            <w:tcW w:type="dxa" w:w="1859"/>
+            <w:vAlign w:val="center"/>
+            <w:shd w:val="clear" w:color="auto" w:fill="F2F5F9"/>
+          </w:tcPr>
+          <w:p>
+            <w:pPr>
+              <w:spacing w:after="0" w:line="240" w:lineRule="auto"/>
+              <w:jc w:val="center"/>
+            </w:pPr>
+            <w:r>
+              <w:rPr>
+                <w:rFonts w:ascii="Cambria" w:hAnsi="Cambria" w:eastAsia="Cambria"/>
+                <w:b w:val="0"/>
+                <w:i w:val="0"/>
+                <w:color w:val="222222"/>
+                <w:sz w:val="16"/>
+              </w:rPr>
+              <w:t>124</w:t>
+            </w:r>
+          </w:p>
+        </w:tc>
+      </w:tr>
+      <w:tr>
+        <w:trPr>
+          <w:cantSplit/>
+        </w:trPr>
+        <w:tc>
+          <w:tcPr>
+            <w:tcW w:type="dxa" w:w="1046"/>
+            <w:vAlign w:val="center"/>
+          </w:tcPr>
+          <w:p>
+            <w:pPr>
+              <w:spacing w:after="0" w:line="240" w:lineRule="auto"/>
+              <w:jc w:val="left"/>
+            </w:pPr>
+            <w:r>
+              <w:rPr>
+                <w:rFonts w:ascii="Cambria" w:hAnsi="Cambria" w:eastAsia="Cambria"/>
                 <w:b/>
                 <w:i w:val="0"/>
                 <w:color w:val="222222"/>
@@ -4935,7 +5600,6 @@
           <w:tcPr>
             <w:tcW w:type="dxa" w:w="1046"/>
             <w:vAlign w:val="center"/>
-            <w:shd w:val="clear" w:color="auto" w:fill="F2F5F9"/>
           </w:tcPr>
           <w:p>
             <w:pPr>
@@ -4950,7 +5614,7 @@
                 <w:color w:val="222222"/>
                 <w:sz w:val="16"/>
               </w:rPr>
-              <w:t>156</w:t>
+              <w:t>390</w:t>
             </w:r>
           </w:p>
         </w:tc>
@@ -4958,7 +5622,6 @@
           <w:tcPr>
             <w:tcW w:type="dxa" w:w="1859"/>
             <w:vAlign w:val="center"/>
-            <w:shd w:val="clear" w:color="auto" w:fill="F2F5F9"/>
           </w:tcPr>
           <w:p>
             <w:pPr>
@@ -4973,7 +5636,7 @@
                 <w:color w:val="222222"/>
                 <w:sz w:val="16"/>
               </w:rPr>
-              <w:t>8,736</w:t>
+              <w:t>46,020</w:t>
             </w:r>
           </w:p>
         </w:tc>
@@ -4981,7 +5644,6 @@
           <w:tcPr>
             <w:tcW w:type="dxa" w:w="1511"/>
             <w:vAlign w:val="center"/>
-            <w:shd w:val="clear" w:color="auto" w:fill="F2F5F9"/>
           </w:tcPr>
           <w:p>
             <w:pPr>
@@ -4996,7 +5658,7 @@
                 <w:color w:val="222222"/>
                 <w:sz w:val="16"/>
               </w:rPr>
-              <w:t>706</w:t>
+              <w:t>2,761</w:t>
             </w:r>
           </w:p>
         </w:tc>
@@ -5004,7 +5666,6 @@
           <w:tcPr>
             <w:tcW w:type="dxa" w:w="1278"/>
             <w:vAlign w:val="center"/>
-            <w:shd w:val="clear" w:color="auto" w:fill="F2F5F9"/>
           </w:tcPr>
           <w:p>
             <w:pPr>
@@ -5019,7 +5680,7 @@
                 <w:color w:val="222222"/>
                 <w:sz w:val="16"/>
               </w:rPr>
-              <w:t>8.08%</w:t>
+              <w:t>6.00%</w:t>
             </w:r>
           </w:p>
         </w:tc>
@@ -5027,7 +5688,6 @@
           <w:tcPr>
             <w:tcW w:type="dxa" w:w="1278"/>
             <w:vAlign w:val="center"/>
-            <w:shd w:val="clear" w:color="auto" w:fill="F2F5F9"/>
           </w:tcPr>
           <w:p>
             <w:pPr>
@@ -5042,7 +5702,7 @@
                 <w:color w:val="222222"/>
                 <w:sz w:val="16"/>
               </w:rPr>
-              <w:t>7,427</w:t>
+              <w:t>39,116</w:t>
             </w:r>
           </w:p>
         </w:tc>
@@ -5050,7 +5710,6 @@
           <w:tcPr>
             <w:tcW w:type="dxa" w:w="1859"/>
             <w:vAlign w:val="center"/>
-            <w:shd w:val="clear" w:color="auto" w:fill="F2F5F9"/>
           </w:tcPr>
           <w:p>
             <w:pPr>
@@ -5065,7 +5724,7 @@
                 <w:color w:val="222222"/>
                 <w:sz w:val="16"/>
               </w:rPr>
-              <w:t>1,309</w:t>
+              <w:t>6,904</w:t>
             </w:r>
           </w:p>
         </w:tc>
@@ -5334,47 +5993,7 @@
           <w:color w:val="222222"/>
           <w:sz w:val="20"/>
         </w:rPr>
-        <w:t xml:space="preserve">The suite used one seed. Consequently, the paper reports descriptive point estimates only. It does </w:t>
-      </w:r>
-      <w:r>
-        <w:rPr>
-          <w:rFonts w:ascii="Cambria" w:hAnsi="Cambria" w:eastAsia="Cambria"/>
-          <w:b/>
-          <w:i w:val="0"/>
-          <w:color w:val="222222"/>
-          <w:sz w:val="20"/>
-        </w:rPr>
-        <w:t>not</w:t>
-      </w:r>
-      <w:r>
-        <w:rPr>
-          <w:rFonts w:ascii="Cambria" w:hAnsi="Cambria" w:eastAsia="Cambria"/>
-          <w:b w:val="0"/>
-          <w:i w:val="0"/>
-          <w:color w:val="222222"/>
-          <w:sz w:val="20"/>
-        </w:rPr>
-        <w:t xml:space="preserve"> report confidence intervals over seeds, paired t-tests, or Wilcoxon tests. The exact status is </w:t>
-      </w:r>
-      <w:r>
-        <w:rPr>
-          <w:rFonts w:ascii="Cambria" w:hAnsi="Cambria" w:eastAsia="Cambria"/>
-          <w:b/>
-          <w:i w:val="0"/>
-          <w:color w:val="222222"/>
-          <w:sz w:val="20"/>
-        </w:rPr>
-        <w:t>STATISTICAL TEST NOT RUN — fewer than 2 paired seeds</w:t>
-      </w:r>
-      <w:r>
-        <w:rPr>
-          <w:rFonts w:ascii="Cambria" w:hAnsi="Cambria" w:eastAsia="Cambria"/>
-          <w:b w:val="0"/>
-          <w:i w:val="0"/>
-          <w:color w:val="222222"/>
-          <w:sz w:val="20"/>
-        </w:rPr>
-        <w:t>. The +0.0031 F1 difference between PowerShield-FL and FedAvg is discussed as a one-window difference, not as evidence of a statistically reliable improvement.</w:t>
+        <w:t>The suite used three seeds. Consequently, the paper reports mean ± standard deviation, 95% confidence intervals, and a paired t-test / Wilcoxon test over seeds. The FedAvg vs PowerShield-FL window-level F1 difference is not statistically significant (paired t p = 0.4038; Wilcoxon p = 0.5). The difference is discussed as a small effect, not as evidence of a statistically reliable improvement.</w:t>
       </w:r>
     </w:p>
     <w:p>
@@ -5535,7 +6154,27 @@
           <w:color w:val="222222"/>
           <w:sz w:val="20"/>
         </w:rPr>
-        <w:t>NOT RUN</w:t>
+        <w:t>EXECUTED</w:t>
+      </w:r>
+      <w:r>
+        <w:rPr>
+          <w:rFonts w:ascii="Cambria" w:hAnsi="Cambria" w:eastAsia="Cambria"/>
+          <w:b w:val="0"/>
+          <w:i w:val="0"/>
+          <w:color w:val="222222"/>
+          <w:sz w:val="20"/>
+        </w:rPr>
+        <w:t xml:space="preserve"> as suite </w:t>
+      </w:r>
+      <w:r>
+        <w:rPr>
+          <w:rFonts w:ascii="Consolas" w:hAnsi="Consolas" w:eastAsia="Consolas"/>
+          <w:b w:val="0"/>
+          <w:i w:val="0"/>
+          <w:color w:val="222222"/>
+          <w:sz w:val="19"/>
+        </w:rPr>
+        <w:t>experiment_20261028_072746_856067_suite_s42</w:t>
       </w:r>
       <w:r>
         <w:rPr>
@@ -5967,7 +6606,7 @@
                 <w:color w:val="222222"/>
                 <w:sz w:val="16"/>
               </w:rPr>
-              <w:t>0.9993</w:t>
+              <w:t>0.9986</w:t>
             </w:r>
           </w:p>
         </w:tc>
@@ -5989,7 +6628,7 @@
                 <w:color w:val="222222"/>
                 <w:sz w:val="16"/>
               </w:rPr>
-              <w:t>0.9938</w:t>
+              <w:t>0.9991</w:t>
             </w:r>
           </w:p>
         </w:tc>
@@ -6011,7 +6650,7 @@
                 <w:color w:val="222222"/>
                 <w:sz w:val="16"/>
               </w:rPr>
-              <w:t>0.9938</w:t>
+              <w:t>0.9739</w:t>
             </w:r>
           </w:p>
         </w:tc>
@@ -6033,7 +6672,7 @@
                 <w:color w:val="222222"/>
                 <w:sz w:val="16"/>
               </w:rPr>
-              <w:t>0.9938</w:t>
+              <w:t>0.9863</w:t>
             </w:r>
           </w:p>
         </w:tc>
@@ -6055,7 +6694,7 @@
                 <w:color w:val="222222"/>
                 <w:sz w:val="16"/>
               </w:rPr>
-              <w:t>0.9986</w:t>
+              <w:t>0.9950</w:t>
             </w:r>
           </w:p>
         </w:tc>
@@ -6077,7 +6716,7 @@
                 <w:color w:val="222222"/>
                 <w:sz w:val="16"/>
               </w:rPr>
-              <w:t>0.9952</w:t>
+              <w:t>0.9849</w:t>
             </w:r>
           </w:p>
         </w:tc>
@@ -6099,7 +6738,7 @@
                 <w:color w:val="222222"/>
                 <w:sz w:val="16"/>
               </w:rPr>
-              <w:t>0.20</w:t>
+              <w:t>0.43</w:t>
             </w:r>
           </w:p>
         </w:tc>
@@ -6150,7 +6789,7 @@
                 <w:color w:val="222222"/>
                 <w:sz w:val="16"/>
               </w:rPr>
-              <w:t>0.9996</w:t>
+              <w:t>0.9965</w:t>
             </w:r>
           </w:p>
         </w:tc>
@@ -6173,7 +6812,7 @@
                 <w:color w:val="222222"/>
                 <w:sz w:val="16"/>
               </w:rPr>
-              <w:t>1.0000</w:t>
+              <w:t>0.9863</w:t>
             </w:r>
           </w:p>
         </w:tc>
@@ -6196,7 +6835,7 @@
                 <w:color w:val="222222"/>
                 <w:sz w:val="16"/>
               </w:rPr>
-              <w:t>0.9938</w:t>
+              <w:t>0.9468</w:t>
             </w:r>
           </w:p>
         </w:tc>
@@ -6219,7 +6858,7 @@
                 <w:color w:val="222222"/>
                 <w:sz w:val="16"/>
               </w:rPr>
-              <w:t>0.9969</w:t>
+              <w:t>0.9660</w:t>
             </w:r>
           </w:p>
         </w:tc>
@@ -6242,7 +6881,7 @@
                 <w:color w:val="222222"/>
                 <w:sz w:val="16"/>
               </w:rPr>
-              <w:t>0.9950</w:t>
+              <w:t>0.9962</w:t>
             </w:r>
           </w:p>
         </w:tc>
@@ -6265,7 +6904,7 @@
                 <w:color w:val="222222"/>
                 <w:sz w:val="16"/>
               </w:rPr>
-              <w:t>0.9942</w:t>
+              <w:t>0.9858</w:t>
             </w:r>
           </w:p>
         </w:tc>
@@ -6288,7 +6927,7 @@
                 <w:color w:val="222222"/>
                 <w:sz w:val="16"/>
               </w:rPr>
-              <w:t>0.35</w:t>
+              <w:t>0.38</w:t>
             </w:r>
           </w:p>
         </w:tc>
@@ -6337,7 +6976,7 @@
                 <w:color w:val="222222"/>
                 <w:sz w:val="16"/>
               </w:rPr>
-              <w:t>0.9829</w:t>
+              <w:t>0.9982</w:t>
             </w:r>
           </w:p>
         </w:tc>
@@ -6359,7 +6998,7 @@
                 <w:color w:val="222222"/>
                 <w:sz w:val="16"/>
               </w:rPr>
-              <w:t>0.7816</w:t>
+              <w:t>1.0000</w:t>
             </w:r>
           </w:p>
         </w:tc>
@@ -6381,7 +7020,7 @@
                 <w:color w:val="222222"/>
                 <w:sz w:val="16"/>
               </w:rPr>
-              <w:t>0.9938</w:t>
+              <w:t>0.9646</w:t>
             </w:r>
           </w:p>
         </w:tc>
@@ -6403,7 +7042,7 @@
                 <w:color w:val="222222"/>
                 <w:sz w:val="16"/>
               </w:rPr>
-              <w:t>0.8750</w:t>
+              <w:t>0.9819</w:t>
             </w:r>
           </w:p>
         </w:tc>
@@ -6425,7 +7064,7 @@
                 <w:color w:val="222222"/>
                 <w:sz w:val="16"/>
               </w:rPr>
-              <w:t>0.9996</w:t>
+              <w:t>0.9940</w:t>
             </w:r>
           </w:p>
         </w:tc>
@@ -6447,7 +7086,7 @@
                 <w:color w:val="222222"/>
                 <w:sz w:val="16"/>
               </w:rPr>
-              <w:t>0.9967</w:t>
+              <w:t>0.9833</w:t>
             </w:r>
           </w:p>
         </w:tc>
@@ -6469,7 +7108,7 @@
                 <w:color w:val="222222"/>
                 <w:sz w:val="16"/>
               </w:rPr>
-              <w:t>0.25</w:t>
+              <w:t>0.35</w:t>
             </w:r>
           </w:p>
         </w:tc>
@@ -6520,7 +7159,7 @@
                 <w:color w:val="222222"/>
                 <w:sz w:val="16"/>
               </w:rPr>
-              <w:t>0.9933</w:t>
+              <w:t>0.9984</w:t>
             </w:r>
           </w:p>
         </w:tc>
@@ -6543,7 +7182,7 @@
                 <w:color w:val="222222"/>
                 <w:sz w:val="16"/>
               </w:rPr>
-              <w:t>0.9045</w:t>
+              <w:t>0.9995</w:t>
             </w:r>
           </w:p>
         </w:tc>
@@ -6566,7 +7205,7 @@
                 <w:color w:val="222222"/>
                 <w:sz w:val="16"/>
               </w:rPr>
-              <w:t>0.9938</w:t>
+              <w:t>0.9688</w:t>
             </w:r>
           </w:p>
         </w:tc>
@@ -6589,7 +7228,7 @@
                 <w:color w:val="222222"/>
                 <w:sz w:val="16"/>
               </w:rPr>
-              <w:t>0.9471</w:t>
+              <w:t>0.9839</w:t>
             </w:r>
           </w:p>
         </w:tc>
@@ -6612,7 +7251,7 @@
                 <w:color w:val="222222"/>
                 <w:sz w:val="16"/>
               </w:rPr>
-              <w:t>0.9991</w:t>
+              <w:t>0.9949</w:t>
             </w:r>
           </w:p>
         </w:tc>
@@ -6635,7 +7274,7 @@
                 <w:color w:val="222222"/>
                 <w:sz w:val="16"/>
               </w:rPr>
-              <w:t>0.9958</w:t>
+              <w:t>0.9846</w:t>
             </w:r>
           </w:p>
         </w:tc>
@@ -6658,7 +7297,7 @@
                 <w:color w:val="222222"/>
                 <w:sz w:val="16"/>
               </w:rPr>
-              <w:t>0.25</w:t>
+              <w:t>0.32</w:t>
             </w:r>
           </w:p>
         </w:tc>
@@ -6707,7 +7346,7 @@
                 <w:color w:val="222222"/>
                 <w:sz w:val="16"/>
               </w:rPr>
-              <w:t>0.9769</w:t>
+              <w:t>0.9866</w:t>
             </w:r>
           </w:p>
         </w:tc>
@@ -6729,7 +7368,7 @@
                 <w:color w:val="222222"/>
                 <w:sz w:val="16"/>
               </w:rPr>
-              <w:t>1.0000</w:t>
+              <w:t>0.9529</w:t>
             </w:r>
           </w:p>
         </w:tc>
@@ -6751,7 +7390,7 @@
                 <w:color w:val="222222"/>
                 <w:sz w:val="16"/>
               </w:rPr>
-              <w:t>0.6173</w:t>
+              <w:t>0.7700</w:t>
             </w:r>
           </w:p>
         </w:tc>
@@ -6773,7 +7412,7 @@
                 <w:color w:val="222222"/>
                 <w:sz w:val="16"/>
               </w:rPr>
-              <w:t>0.7634</w:t>
+              <w:t>0.8476</w:t>
             </w:r>
           </w:p>
         </w:tc>
@@ -6795,7 +7434,7 @@
                 <w:color w:val="222222"/>
                 <w:sz w:val="16"/>
               </w:rPr>
-              <w:t>0.9444</w:t>
+              <w:t>0.9696</w:t>
             </w:r>
           </w:p>
         </w:tc>
@@ -6817,7 +7456,7 @@
                 <w:color w:val="222222"/>
                 <w:sz w:val="16"/>
               </w:rPr>
-              <w:t>0.7797</w:t>
+              <w:t>0.8689</w:t>
             </w:r>
           </w:p>
         </w:tc>
@@ -6839,7 +7478,7 @@
                 <w:color w:val="222222"/>
                 <w:sz w:val="16"/>
               </w:rPr>
-              <w:t>0.45</w:t>
+              <w:t>0.82</w:t>
             </w:r>
           </w:p>
         </w:tc>
@@ -8195,7 +8834,7 @@
                 <w:color w:val="222222"/>
                 <w:sz w:val="16"/>
               </w:rPr>
-              <w:t>0.9877</w:t>
+              <w:t>0.9653</w:t>
             </w:r>
           </w:p>
         </w:tc>
@@ -8217,7 +8856,7 @@
                 <w:color w:val="222222"/>
                 <w:sz w:val="16"/>
               </w:rPr>
-              <w:t>0.9938</w:t>
+              <w:t>0.9823</w:t>
             </w:r>
           </w:p>
         </w:tc>
@@ -8239,7 +8878,7 @@
                 <w:color w:val="222222"/>
                 <w:sz w:val="16"/>
               </w:rPr>
-              <w:t>0.9973</w:t>
+              <w:t>0.9930</w:t>
             </w:r>
           </w:p>
         </w:tc>
@@ -8261,7 +8900,7 @@
                 <w:color w:val="222222"/>
                 <w:sz w:val="16"/>
               </w:rPr>
-              <w:t>0.9927</w:t>
+              <w:t>0.9816</w:t>
             </w:r>
           </w:p>
         </w:tc>
@@ -8283,7 +8922,7 @@
                 <w:color w:val="222222"/>
                 <w:sz w:val="16"/>
               </w:rPr>
-              <w:t>15.51</w:t>
+              <w:t>284.24</w:t>
             </w:r>
           </w:p>
         </w:tc>
@@ -8305,7 +8944,7 @@
                 <w:color w:val="222222"/>
                 <w:sz w:val="16"/>
               </w:rPr>
-              <w:t>3,453,520</w:t>
+              <w:t>21,584,500</w:t>
             </w:r>
           </w:p>
         </w:tc>
@@ -8356,7 +8995,7 @@
                 <w:color w:val="222222"/>
                 <w:sz w:val="16"/>
               </w:rPr>
-              <w:t>1.0000</w:t>
+              <w:t>0.9989</w:t>
             </w:r>
           </w:p>
         </w:tc>
@@ -8379,7 +9018,7 @@
                 <w:color w:val="222222"/>
                 <w:sz w:val="16"/>
               </w:rPr>
-              <w:t>0.9938</w:t>
+              <w:t>0.9622</w:t>
             </w:r>
           </w:p>
         </w:tc>
@@ -8402,7 +9041,7 @@
                 <w:color w:val="222222"/>
                 <w:sz w:val="16"/>
               </w:rPr>
-              <w:t>0.9969</w:t>
+              <w:t>0.9802</w:t>
             </w:r>
           </w:p>
         </w:tc>
@@ -8425,7 +9064,7 @@
                 <w:color w:val="222222"/>
                 <w:sz w:val="16"/>
               </w:rPr>
-              <w:t>0.9969</w:t>
+              <w:t>0.9930</w:t>
             </w:r>
           </w:p>
         </w:tc>
@@ -8448,7 +9087,7 @@
                 <w:color w:val="222222"/>
                 <w:sz w:val="16"/>
               </w:rPr>
-              <w:t>0.9945</w:t>
+              <w:t>0.9816</w:t>
             </w:r>
           </w:p>
         </w:tc>
@@ -8471,7 +9110,7 @@
                 <w:color w:val="222222"/>
                 <w:sz w:val="16"/>
               </w:rPr>
-              <w:t>15.97</w:t>
+              <w:t>316.62</w:t>
             </w:r>
           </w:p>
         </w:tc>
@@ -8494,7 +9133,7 @@
                 <w:color w:val="222222"/>
                 <w:sz w:val="16"/>
               </w:rPr>
-              <w:t>902,449</w:t>
+              <w:t>5,640,225</w:t>
             </w:r>
           </w:p>
         </w:tc>
@@ -8911,7 +9550,7 @@
                 <w:color w:val="222222"/>
                 <w:sz w:val="16"/>
               </w:rPr>
-              <w:t>0.9875</w:t>
+              <w:t>1.0000</w:t>
             </w:r>
           </w:p>
         </w:tc>
@@ -8933,7 +9572,7 @@
                 <w:color w:val="222222"/>
                 <w:sz w:val="16"/>
               </w:rPr>
-              <w:t>0.9753</w:t>
+              <w:t>0.9379</w:t>
             </w:r>
           </w:p>
         </w:tc>
@@ -8955,7 +9594,7 @@
                 <w:color w:val="222222"/>
                 <w:sz w:val="16"/>
               </w:rPr>
-              <w:t>0.9814</w:t>
+              <w:t>0.9679</w:t>
             </w:r>
           </w:p>
         </w:tc>
@@ -8977,7 +9616,7 @@
                 <w:color w:val="222222"/>
                 <w:sz w:val="16"/>
               </w:rPr>
-              <w:t>0.9971</w:t>
+              <w:t>0.9737</w:t>
             </w:r>
           </w:p>
         </w:tc>
@@ -8999,7 +9638,7 @@
                 <w:color w:val="222222"/>
                 <w:sz w:val="16"/>
               </w:rPr>
-              <w:t>1,726,760</w:t>
+              <w:t>3,453,520</w:t>
             </w:r>
           </w:p>
         </w:tc>
@@ -9072,7 +9711,7 @@
                 <w:color w:val="222222"/>
                 <w:sz w:val="16"/>
               </w:rPr>
-              <w:t>0.9875</w:t>
+              <w:t>1.0000</w:t>
             </w:r>
           </w:p>
         </w:tc>
@@ -9095,7 +9734,7 @@
                 <w:color w:val="222222"/>
                 <w:sz w:val="16"/>
               </w:rPr>
-              <w:t>0.9753</w:t>
+              <w:t>0.9402</w:t>
             </w:r>
           </w:p>
         </w:tc>
@@ -9118,7 +9757,7 @@
                 <w:color w:val="222222"/>
                 <w:sz w:val="16"/>
               </w:rPr>
-              <w:t>0.9814</w:t>
+              <w:t>0.9692</w:t>
             </w:r>
           </w:p>
         </w:tc>
@@ -9141,7 +9780,7 @@
                 <w:color w:val="222222"/>
                 <w:sz w:val="16"/>
               </w:rPr>
-              <w:t>0.9970</w:t>
+              <w:t>0.9734</w:t>
             </w:r>
           </w:p>
         </w:tc>
@@ -9164,7 +9803,7 @@
                 <w:color w:val="222222"/>
                 <w:sz w:val="16"/>
               </w:rPr>
-              <w:t>451,222</w:t>
+              <w:t>902,464</w:t>
             </w:r>
           </w:p>
         </w:tc>
@@ -9236,7 +9875,7 @@
                 <w:color w:val="222222"/>
                 <w:sz w:val="16"/>
               </w:rPr>
-              <w:t>1.0000</w:t>
+              <w:t>0.9974</w:t>
             </w:r>
           </w:p>
         </w:tc>
@@ -9258,7 +9897,7 @@
                 <w:color w:val="222222"/>
                 <w:sz w:val="16"/>
               </w:rPr>
-              <w:t>0.8642</w:t>
+              <w:t>0.9109</w:t>
             </w:r>
           </w:p>
         </w:tc>
@@ -9280,7 +9919,7 @@
                 <w:color w:val="222222"/>
                 <w:sz w:val="16"/>
               </w:rPr>
-              <w:t>0.9272</w:t>
+              <w:t>0.9522</w:t>
             </w:r>
           </w:p>
         </w:tc>
@@ -9302,7 +9941,7 @@
                 <w:color w:val="222222"/>
                 <w:sz w:val="16"/>
               </w:rPr>
-              <w:t>0.9950</w:t>
+              <w:t>0.9729</w:t>
             </w:r>
           </w:p>
         </w:tc>
@@ -9324,7 +9963,7 @@
                 <w:color w:val="222222"/>
                 <w:sz w:val="16"/>
               </w:rPr>
-              <w:t>700,440</w:t>
+              <w:t>1,400,880</w:t>
             </w:r>
           </w:p>
         </w:tc>
@@ -9397,7 +10036,7 @@
                 <w:color w:val="222222"/>
                 <w:sz w:val="16"/>
               </w:rPr>
-              <w:t>1.0000</w:t>
+              <w:t>0.9962</w:t>
             </w:r>
           </w:p>
         </w:tc>
@@ -9420,7 +10059,7 @@
                 <w:color w:val="222222"/>
                 <w:sz w:val="16"/>
               </w:rPr>
-              <w:t>0.8580</w:t>
+              <w:t>0.9156</w:t>
             </w:r>
           </w:p>
         </w:tc>
@@ -9443,7 +10082,7 @@
                 <w:color w:val="222222"/>
                 <w:sz w:val="16"/>
               </w:rPr>
-              <w:t>0.9236</w:t>
+              <w:t>0.9542</w:t>
             </w:r>
           </w:p>
         </w:tc>
@@ -9466,7 +10105,7 @@
                 <w:color w:val="222222"/>
                 <w:sz w:val="16"/>
               </w:rPr>
-              <w:t>0.9948</w:t>
+              <w:t>0.9735</w:t>
             </w:r>
           </w:p>
         </w:tc>
@@ -9489,7 +10128,7 @@
                 <w:color w:val="222222"/>
                 <w:sz w:val="16"/>
               </w:rPr>
-              <w:t>451,227</w:t>
+              <w:t>902,486</w:t>
             </w:r>
           </w:p>
         </w:tc>
@@ -9893,7 +10532,7 @@
                 <w:color w:val="222222"/>
                 <w:sz w:val="16"/>
               </w:rPr>
-              <w:t>0.9938</w:t>
+              <w:t>1.0000</w:t>
             </w:r>
           </w:p>
         </w:tc>
@@ -9915,7 +10554,7 @@
                 <w:color w:val="222222"/>
                 <w:sz w:val="16"/>
               </w:rPr>
-              <w:t>0.9877</w:t>
+              <w:t>0.9484</w:t>
             </w:r>
           </w:p>
         </w:tc>
@@ -9937,7 +10576,7 @@
                 <w:color w:val="222222"/>
                 <w:sz w:val="16"/>
               </w:rPr>
-              <w:t>0.9907</w:t>
+              <w:t>0.9735</w:t>
             </w:r>
           </w:p>
         </w:tc>
@@ -9959,7 +10598,7 @@
                 <w:color w:val="222222"/>
                 <w:sz w:val="16"/>
               </w:rPr>
-              <w:t>0.9974</w:t>
+              <w:t>0.9799</w:t>
             </w:r>
           </w:p>
         </w:tc>
@@ -10032,7 +10671,7 @@
                 <w:color w:val="222222"/>
                 <w:sz w:val="16"/>
               </w:rPr>
-              <w:t>0.9875</w:t>
+              <w:t>1.0000</w:t>
             </w:r>
           </w:p>
         </w:tc>
@@ -10055,7 +10694,7 @@
                 <w:color w:val="222222"/>
                 <w:sz w:val="16"/>
               </w:rPr>
-              <w:t>0.9753</w:t>
+              <w:t>0.9402</w:t>
             </w:r>
           </w:p>
         </w:tc>
@@ -10078,7 +10717,7 @@
                 <w:color w:val="222222"/>
                 <w:sz w:val="16"/>
               </w:rPr>
-              <w:t>0.9814</w:t>
+              <w:t>0.9692</w:t>
             </w:r>
           </w:p>
         </w:tc>
@@ -10101,7 +10740,7 @@
                 <w:color w:val="222222"/>
                 <w:sz w:val="16"/>
               </w:rPr>
-              <w:t>0.9970</w:t>
+              <w:t>0.9730</w:t>
             </w:r>
           </w:p>
         </w:tc>
@@ -10173,7 +10812,7 @@
                 <w:color w:val="222222"/>
                 <w:sz w:val="16"/>
               </w:rPr>
-              <w:t>0.9875</w:t>
+              <w:t>1.0000</w:t>
             </w:r>
           </w:p>
         </w:tc>
@@ -10195,7 +10834,7 @@
                 <w:color w:val="222222"/>
                 <w:sz w:val="16"/>
               </w:rPr>
-              <w:t>0.9753</w:t>
+              <w:t>0.9402</w:t>
             </w:r>
           </w:p>
         </w:tc>
@@ -10217,7 +10856,7 @@
                 <w:color w:val="222222"/>
                 <w:sz w:val="16"/>
               </w:rPr>
-              <w:t>0.9814</w:t>
+              <w:t>0.9692</w:t>
             </w:r>
           </w:p>
         </w:tc>
@@ -10239,7 +10878,7 @@
                 <w:color w:val="222222"/>
                 <w:sz w:val="16"/>
               </w:rPr>
-              <w:t>0.9970</w:t>
+              <w:t>0.9734</w:t>
             </w:r>
           </w:p>
         </w:tc>
@@ -10312,7 +10951,7 @@
                 <w:color w:val="222222"/>
                 <w:sz w:val="16"/>
               </w:rPr>
-              <w:t>0.9875</w:t>
+              <w:t>1.0000</w:t>
             </w:r>
           </w:p>
         </w:tc>
@@ -10335,7 +10974,7 @@
                 <w:color w:val="222222"/>
                 <w:sz w:val="16"/>
               </w:rPr>
-              <w:t>0.9753</w:t>
+              <w:t>0.9402</w:t>
             </w:r>
           </w:p>
         </w:tc>
@@ -10358,7 +10997,7 @@
                 <w:color w:val="222222"/>
                 <w:sz w:val="16"/>
               </w:rPr>
-              <w:t>0.9814</w:t>
+              <w:t>0.9692</w:t>
             </w:r>
           </w:p>
         </w:tc>
@@ -10381,7 +11020,7 @@
                 <w:color w:val="222222"/>
                 <w:sz w:val="16"/>
               </w:rPr>
-              <w:t>0.9970</w:t>
+              <w:t>0.9735</w:t>
             </w:r>
           </w:p>
         </w:tc>
@@ -10453,7 +11092,7 @@
                 <w:color w:val="222222"/>
                 <w:sz w:val="16"/>
               </w:rPr>
-              <w:t>0.9875</w:t>
+              <w:t>1.0000</w:t>
             </w:r>
           </w:p>
         </w:tc>
@@ -10475,7 +11114,7 @@
                 <w:color w:val="222222"/>
                 <w:sz w:val="16"/>
               </w:rPr>
-              <w:t>0.9753</w:t>
+              <w:t>0.9402</w:t>
             </w:r>
           </w:p>
         </w:tc>
@@ -10497,7 +11136,7 @@
                 <w:color w:val="222222"/>
                 <w:sz w:val="16"/>
               </w:rPr>
-              <w:t>0.9814</w:t>
+              <w:t>0.9692</w:t>
             </w:r>
           </w:p>
         </w:tc>
@@ -10519,7 +11158,7 @@
                 <w:color w:val="222222"/>
                 <w:sz w:val="16"/>
               </w:rPr>
-              <w:t>0.9969</w:t>
+              <w:t>0.9733</w:t>
             </w:r>
           </w:p>
         </w:tc>
@@ -10934,7 +11573,7 @@
                 <w:color w:val="222222"/>
                 <w:sz w:val="16"/>
               </w:rPr>
-              <w:t>0.9981</w:t>
+              <w:t>0.9971</w:t>
             </w:r>
           </w:p>
         </w:tc>
@@ -10956,7 +11595,7 @@
                 <w:color w:val="222222"/>
                 <w:sz w:val="16"/>
               </w:rPr>
-              <w:t>0.9816</w:t>
+              <w:t>1.0000</w:t>
             </w:r>
           </w:p>
         </w:tc>
@@ -10978,7 +11617,7 @@
                 <w:color w:val="222222"/>
                 <w:sz w:val="16"/>
               </w:rPr>
-              <w:t>0.9877</w:t>
+              <w:t>0.9519</w:t>
             </w:r>
           </w:p>
         </w:tc>
@@ -11000,7 +11639,7 @@
                 <w:color w:val="222222"/>
                 <w:sz w:val="16"/>
               </w:rPr>
-              <w:t>0.9846</w:t>
+              <w:t>0.9754</w:t>
             </w:r>
           </w:p>
         </w:tc>
@@ -11022,7 +11661,7 @@
                 <w:color w:val="222222"/>
                 <w:sz w:val="16"/>
               </w:rPr>
-              <w:t>0.9954</w:t>
+              <w:t>0.9898</w:t>
             </w:r>
           </w:p>
         </w:tc>
@@ -11044,7 +11683,7 @@
                 <w:color w:val="222222"/>
                 <w:sz w:val="16"/>
               </w:rPr>
-              <w:t>6.558</w:t>
+              <w:t>36.96</w:t>
             </w:r>
           </w:p>
         </w:tc>
@@ -11066,7 +11705,7 @@
                 <w:color w:val="222222"/>
                 <w:sz w:val="16"/>
               </w:rPr>
-              <w:t>180,497</w:t>
+              <w:t>180,495</w:t>
             </w:r>
           </w:p>
         </w:tc>
@@ -11117,7 +11756,7 @@
                 <w:color w:val="222222"/>
                 <w:sz w:val="16"/>
               </w:rPr>
-              <w:t>0.9978</w:t>
+              <w:t>0.9969</w:t>
             </w:r>
           </w:p>
         </w:tc>
@@ -11140,13 +11779,82 @@
                 <w:color w:val="222222"/>
                 <w:sz w:val="16"/>
               </w:rPr>
+              <w:t>1.0000</w:t>
+            </w:r>
+          </w:p>
+        </w:tc>
+        <w:tc>
+          <w:tcPr>
+            <w:tcW w:type="dxa" w:w="885"/>
+            <w:vAlign w:val="center"/>
+            <w:shd w:val="clear" w:color="auto" w:fill="F2F5F9"/>
+          </w:tcPr>
+          <w:p>
+            <w:pPr>
+              <w:spacing w:after="0" w:line="240" w:lineRule="auto"/>
+              <w:jc w:val="center"/>
+            </w:pPr>
+            <w:r>
+              <w:rPr>
+                <w:rFonts w:ascii="Cambria" w:hAnsi="Cambria" w:eastAsia="Cambria"/>
+                <w:b w:val="0"/>
+                <w:i w:val="0"/>
+                <w:color w:val="222222"/>
+                <w:sz w:val="16"/>
+              </w:rPr>
+              <w:t>0.9484</w:t>
+            </w:r>
+          </w:p>
+        </w:tc>
+        <w:tc>
+          <w:tcPr>
+            <w:tcW w:type="dxa" w:w="885"/>
+            <w:vAlign w:val="center"/>
+            <w:shd w:val="clear" w:color="auto" w:fill="F2F5F9"/>
+          </w:tcPr>
+          <w:p>
+            <w:pPr>
+              <w:spacing w:after="0" w:line="240" w:lineRule="auto"/>
+              <w:jc w:val="center"/>
+            </w:pPr>
+            <w:r>
+              <w:rPr>
+                <w:rFonts w:ascii="Cambria" w:hAnsi="Cambria" w:eastAsia="Cambria"/>
+                <w:b w:val="0"/>
+                <w:i w:val="0"/>
+                <w:color w:val="222222"/>
+                <w:sz w:val="16"/>
+              </w:rPr>
+              <w:t>0.9735</w:t>
+            </w:r>
+          </w:p>
+        </w:tc>
+        <w:tc>
+          <w:tcPr>
+            <w:tcW w:type="dxa" w:w="1032"/>
+            <w:vAlign w:val="center"/>
+            <w:shd w:val="clear" w:color="auto" w:fill="F2F5F9"/>
+          </w:tcPr>
+          <w:p>
+            <w:pPr>
+              <w:spacing w:after="0" w:line="240" w:lineRule="auto"/>
+              <w:jc w:val="center"/>
+            </w:pPr>
+            <w:r>
+              <w:rPr>
+                <w:rFonts w:ascii="Cambria" w:hAnsi="Cambria" w:eastAsia="Cambria"/>
+                <w:b w:val="0"/>
+                <w:i w:val="0"/>
+                <w:color w:val="222222"/>
+                <w:sz w:val="16"/>
+              </w:rPr>
               <w:t>0.9875</w:t>
             </w:r>
           </w:p>
         </w:tc>
         <w:tc>
           <w:tcPr>
-            <w:tcW w:type="dxa" w:w="885"/>
+            <w:tcW w:type="dxa" w:w="1917"/>
             <w:vAlign w:val="center"/>
             <w:shd w:val="clear" w:color="auto" w:fill="F2F5F9"/>
           </w:tcPr>
@@ -11163,13 +11871,13 @@
                 <w:color w:val="222222"/>
                 <w:sz w:val="16"/>
               </w:rPr>
-              <w:t>0.9753</w:t>
-            </w:r>
-          </w:p>
-        </w:tc>
-        <w:tc>
-          <w:tcPr>
-            <w:tcW w:type="dxa" w:w="885"/>
+              <w:t>32.62</w:t>
+            </w:r>
+          </w:p>
+        </w:tc>
+        <w:tc>
+          <w:tcPr>
+            <w:tcW w:type="dxa" w:w="1622"/>
             <w:vAlign w:val="center"/>
             <w:shd w:val="clear" w:color="auto" w:fill="F2F5F9"/>
           </w:tcPr>
@@ -11186,76 +11894,7 @@
                 <w:color w:val="222222"/>
                 <w:sz w:val="16"/>
               </w:rPr>
-              <w:t>0.9814</w:t>
-            </w:r>
-          </w:p>
-        </w:tc>
-        <w:tc>
-          <w:tcPr>
-            <w:tcW w:type="dxa" w:w="1032"/>
-            <w:vAlign w:val="center"/>
-            <w:shd w:val="clear" w:color="auto" w:fill="F2F5F9"/>
-          </w:tcPr>
-          <w:p>
-            <w:pPr>
-              <w:spacing w:after="0" w:line="240" w:lineRule="auto"/>
-              <w:jc w:val="center"/>
-            </w:pPr>
-            <w:r>
-              <w:rPr>
-                <w:rFonts w:ascii="Cambria" w:hAnsi="Cambria" w:eastAsia="Cambria"/>
-                <w:b w:val="0"/>
-                <w:i w:val="0"/>
-                <w:color w:val="222222"/>
-                <w:sz w:val="16"/>
-              </w:rPr>
-              <w:t>0.9970</w:t>
-            </w:r>
-          </w:p>
-        </w:tc>
-        <w:tc>
-          <w:tcPr>
-            <w:tcW w:type="dxa" w:w="1917"/>
-            <w:vAlign w:val="center"/>
-            <w:shd w:val="clear" w:color="auto" w:fill="F2F5F9"/>
-          </w:tcPr>
-          <w:p>
-            <w:pPr>
-              <w:spacing w:after="0" w:line="240" w:lineRule="auto"/>
-              <w:jc w:val="center"/>
-            </w:pPr>
-            <w:r>
-              <w:rPr>
-                <w:rFonts w:ascii="Cambria" w:hAnsi="Cambria" w:eastAsia="Cambria"/>
-                <w:b w:val="0"/>
-                <w:i w:val="0"/>
-                <w:color w:val="222222"/>
-                <w:sz w:val="16"/>
-              </w:rPr>
-              <w:t>7.604</w:t>
-            </w:r>
-          </w:p>
-        </w:tc>
-        <w:tc>
-          <w:tcPr>
-            <w:tcW w:type="dxa" w:w="1622"/>
-            <w:vAlign w:val="center"/>
-            <w:shd w:val="clear" w:color="auto" w:fill="F2F5F9"/>
-          </w:tcPr>
-          <w:p>
-            <w:pPr>
-              <w:spacing w:after="0" w:line="240" w:lineRule="auto"/>
-              <w:jc w:val="center"/>
-            </w:pPr>
-            <w:r>
-              <w:rPr>
-                <w:rFonts w:ascii="Cambria" w:hAnsi="Cambria" w:eastAsia="Cambria"/>
-                <w:b w:val="0"/>
-                <w:i w:val="0"/>
-                <w:color w:val="222222"/>
-                <w:sz w:val="16"/>
-              </w:rPr>
-              <w:t>451,222</w:t>
+              <w:t>451,256</w:t>
             </w:r>
           </w:p>
         </w:tc>
@@ -11304,7 +11943,7 @@
                 <w:color w:val="222222"/>
                 <w:sz w:val="16"/>
               </w:rPr>
-              <w:t>0.9829</w:t>
+              <w:t>0.9964</w:t>
             </w:r>
           </w:p>
         </w:tc>
@@ -11326,7 +11965,7 @@
                 <w:color w:val="222222"/>
                 <w:sz w:val="16"/>
               </w:rPr>
-              <w:t>0.9754</w:t>
+              <w:t>1.0000</w:t>
             </w:r>
           </w:p>
         </w:tc>
@@ -11348,7 +11987,7 @@
                 <w:color w:val="222222"/>
                 <w:sz w:val="16"/>
               </w:rPr>
-              <w:t>0.7346</w:t>
+              <w:t>0.9402</w:t>
             </w:r>
           </w:p>
         </w:tc>
@@ -11370,7 +12009,7 @@
                 <w:color w:val="222222"/>
                 <w:sz w:val="16"/>
               </w:rPr>
-              <w:t>0.8380</w:t>
+              <w:t>0.9692</w:t>
             </w:r>
           </w:p>
         </w:tc>
@@ -11392,7 +12031,7 @@
                 <w:color w:val="222222"/>
                 <w:sz w:val="16"/>
               </w:rPr>
-              <w:t>0.9861</w:t>
+              <w:t>0.9734</w:t>
             </w:r>
           </w:p>
         </w:tc>
@@ -11414,7 +12053,7 @@
                 <w:color w:val="222222"/>
                 <w:sz w:val="16"/>
               </w:rPr>
-              <w:t>8.954</w:t>
+              <w:t>33.64</w:t>
             </w:r>
           </w:p>
         </w:tc>
@@ -11436,7 +12075,196 @@
                 <w:color w:val="222222"/>
                 <w:sz w:val="16"/>
               </w:rPr>
-              <w:t>902,445</w:t>
+              <w:t>902,464</w:t>
+            </w:r>
+          </w:p>
+        </w:tc>
+      </w:tr>
+      <w:tr>
+        <w:trPr>
+          <w:cantSplit/>
+        </w:trPr>
+        <w:tc>
+          <w:tcPr>
+            <w:tcW w:type="dxa" w:w="1032"/>
+            <w:vAlign w:val="center"/>
+            <w:shd w:val="clear" w:color="auto" w:fill="F2F5F9"/>
+          </w:tcPr>
+          <w:p>
+            <w:pPr>
+              <w:spacing w:after="0" w:line="240" w:lineRule="auto"/>
+              <w:jc w:val="left"/>
+            </w:pPr>
+            <w:r>
+              <w:rPr>
+                <w:rFonts w:ascii="Cambria" w:hAnsi="Cambria" w:eastAsia="Cambria"/>
+                <w:b w:val="0"/>
+                <w:i w:val="0"/>
+                <w:color w:val="222222"/>
+                <w:sz w:val="16"/>
+              </w:rPr>
+              <w:t>20</w:t>
+            </w:r>
+          </w:p>
+        </w:tc>
+        <w:tc>
+          <w:tcPr>
+            <w:tcW w:type="dxa" w:w="1180"/>
+            <w:vAlign w:val="center"/>
+            <w:shd w:val="clear" w:color="auto" w:fill="F2F5F9"/>
+          </w:tcPr>
+          <w:p>
+            <w:pPr>
+              <w:spacing w:after="0" w:line="240" w:lineRule="auto"/>
+              <w:jc w:val="center"/>
+            </w:pPr>
+            <w:r>
+              <w:rPr>
+                <w:rFonts w:ascii="Cambria" w:hAnsi="Cambria" w:eastAsia="Cambria"/>
+                <w:b w:val="0"/>
+                <w:i w:val="0"/>
+                <w:color w:val="222222"/>
+                <w:sz w:val="16"/>
+              </w:rPr>
+              <w:t>0.9940</w:t>
+            </w:r>
+          </w:p>
+        </w:tc>
+        <w:tc>
+          <w:tcPr>
+            <w:tcW w:type="dxa" w:w="1327"/>
+            <w:vAlign w:val="center"/>
+            <w:shd w:val="clear" w:color="auto" w:fill="F2F5F9"/>
+          </w:tcPr>
+          <w:p>
+            <w:pPr>
+              <w:spacing w:after="0" w:line="240" w:lineRule="auto"/>
+              <w:jc w:val="center"/>
+            </w:pPr>
+            <w:r>
+              <w:rPr>
+                <w:rFonts w:ascii="Cambria" w:hAnsi="Cambria" w:eastAsia="Cambria"/>
+                <w:b w:val="0"/>
+                <w:i w:val="0"/>
+                <w:color w:val="222222"/>
+                <w:sz w:val="16"/>
+              </w:rPr>
+              <w:t>0.9638</w:t>
+            </w:r>
+          </w:p>
+        </w:tc>
+        <w:tc>
+          <w:tcPr>
+            <w:tcW w:type="dxa" w:w="885"/>
+            <w:vAlign w:val="center"/>
+            <w:shd w:val="clear" w:color="auto" w:fill="F2F5F9"/>
+          </w:tcPr>
+          <w:p>
+            <w:pPr>
+              <w:spacing w:after="0" w:line="240" w:lineRule="auto"/>
+              <w:jc w:val="center"/>
+            </w:pPr>
+            <w:r>
+              <w:rPr>
+                <w:rFonts w:ascii="Cambria" w:hAnsi="Cambria" w:eastAsia="Cambria"/>
+                <w:b w:val="0"/>
+                <w:i w:val="0"/>
+                <w:color w:val="222222"/>
+                <w:sz w:val="16"/>
+              </w:rPr>
+              <w:t>0.9355</w:t>
+            </w:r>
+          </w:p>
+        </w:tc>
+        <w:tc>
+          <w:tcPr>
+            <w:tcW w:type="dxa" w:w="885"/>
+            <w:vAlign w:val="center"/>
+            <w:shd w:val="clear" w:color="auto" w:fill="F2F5F9"/>
+          </w:tcPr>
+          <w:p>
+            <w:pPr>
+              <w:spacing w:after="0" w:line="240" w:lineRule="auto"/>
+              <w:jc w:val="center"/>
+            </w:pPr>
+            <w:r>
+              <w:rPr>
+                <w:rFonts w:ascii="Cambria" w:hAnsi="Cambria" w:eastAsia="Cambria"/>
+                <w:b w:val="0"/>
+                <w:i w:val="0"/>
+                <w:color w:val="222222"/>
+                <w:sz w:val="16"/>
+              </w:rPr>
+              <w:t>0.9494</w:t>
+            </w:r>
+          </w:p>
+        </w:tc>
+        <w:tc>
+          <w:tcPr>
+            <w:tcW w:type="dxa" w:w="1032"/>
+            <w:vAlign w:val="center"/>
+            <w:shd w:val="clear" w:color="auto" w:fill="F2F5F9"/>
+          </w:tcPr>
+          <w:p>
+            <w:pPr>
+              <w:spacing w:after="0" w:line="240" w:lineRule="auto"/>
+              <w:jc w:val="center"/>
+            </w:pPr>
+            <w:r>
+              <w:rPr>
+                <w:rFonts w:ascii="Cambria" w:hAnsi="Cambria" w:eastAsia="Cambria"/>
+                <w:b w:val="0"/>
+                <w:i w:val="0"/>
+                <w:color w:val="222222"/>
+                <w:sz w:val="16"/>
+              </w:rPr>
+              <w:t>0.9743</w:t>
+            </w:r>
+          </w:p>
+        </w:tc>
+        <w:tc>
+          <w:tcPr>
+            <w:tcW w:type="dxa" w:w="1917"/>
+            <w:vAlign w:val="center"/>
+            <w:shd w:val="clear" w:color="auto" w:fill="F2F5F9"/>
+          </w:tcPr>
+          <w:p>
+            <w:pPr>
+              <w:spacing w:after="0" w:line="240" w:lineRule="auto"/>
+              <w:jc w:val="center"/>
+            </w:pPr>
+            <w:r>
+              <w:rPr>
+                <w:rFonts w:ascii="Cambria" w:hAnsi="Cambria" w:eastAsia="Cambria"/>
+                <w:b w:val="0"/>
+                <w:i w:val="0"/>
+                <w:color w:val="222222"/>
+                <w:sz w:val="16"/>
+              </w:rPr>
+              <w:t>48.00</w:t>
+            </w:r>
+          </w:p>
+        </w:tc>
+        <w:tc>
+          <w:tcPr>
+            <w:tcW w:type="dxa" w:w="1622"/>
+            <w:vAlign w:val="center"/>
+            <w:shd w:val="clear" w:color="auto" w:fill="F2F5F9"/>
+          </w:tcPr>
+          <w:p>
+            <w:pPr>
+              <w:spacing w:after="0" w:line="240" w:lineRule="auto"/>
+              <w:jc w:val="center"/>
+            </w:pPr>
+            <w:r>
+              <w:rPr>
+                <w:rFonts w:ascii="Cambria" w:hAnsi="Cambria" w:eastAsia="Cambria"/>
+                <w:b w:val="0"/>
+                <w:i w:val="0"/>
+                <w:color w:val="222222"/>
+                <w:sz w:val="16"/>
+              </w:rPr>
+              <w:t>1,804,808</w:t>
             </w:r>
           </w:p>
         </w:tc>
@@ -12620,7 +13448,7 @@
           <w:color w:val="222222"/>
           <w:sz w:val="20"/>
         </w:rPr>
-        <w:t xml:space="preserve">Permutation importance over 1,500 test windows and five repeats has a baseline ROC-AUC of 0.996682. The most important features are </w:t>
+        <w:t xml:space="preserve">Permutation importance over 1,500 test windows and five repeats has a baseline ROC-AUC of 1.000000. The most important features are </w:t>
       </w:r>
       <w:r>
         <w:rPr>
@@ -12640,7 +13468,7 @@
           <w:color w:val="222222"/>
           <w:sz w:val="20"/>
         </w:rPr>
-        <w:t xml:space="preserve"> (0.01159 ± 0.00248), </w:t>
+        <w:t xml:space="preserve"> (0.02010 ± 0.00275), </w:t>
       </w:r>
       <w:r>
         <w:rPr>
@@ -12650,7 +13478,7 @@
           <w:color w:val="222222"/>
           <w:sz w:val="19"/>
         </w:rPr>
-        <w:t>max_daily_drop</w:t>
+        <w:t>daily_diff_std</w:t>
       </w:r>
       <w:r>
         <w:rPr>
@@ -12660,7 +13488,7 @@
           <w:color w:val="222222"/>
           <w:sz w:val="20"/>
         </w:rPr>
-        <w:t xml:space="preserve"> (0.00704 ± 0.00067), </w:t>
+        <w:t xml:space="preserve"> (0.00899 ± 0.00099), </w:t>
       </w:r>
       <w:r>
         <w:rPr>
@@ -12670,7 +13498,7 @@
           <w:color w:val="222222"/>
           <w:sz w:val="19"/>
         </w:rPr>
-        <w:t>daily_diff_std</w:t>
+        <w:t>weekend_weekday_ratio</w:t>
       </w:r>
       <w:r>
         <w:rPr>
@@ -12680,7 +13508,7 @@
           <w:color w:val="222222"/>
           <w:sz w:val="20"/>
         </w:rPr>
-        <w:t xml:space="preserve"> (0.00487 ± 0.00087), </w:t>
+        <w:t xml:space="preserve"> (0.00306 ± 0.00272), </w:t>
       </w:r>
       <w:r>
         <w:rPr>
@@ -12690,7 +13518,7 @@
           <w:color w:val="222222"/>
           <w:sz w:val="19"/>
         </w:rPr>
-        <w:t>mean_daily_drop</w:t>
+        <w:t>max_daily_drop</w:t>
       </w:r>
       <w:r>
         <w:rPr>
@@ -12700,7 +13528,7 @@
           <w:color w:val="222222"/>
           <w:sz w:val="20"/>
         </w:rPr>
-        <w:t xml:space="preserve"> (0.000802 ± 0.000236), and </w:t>
+        <w:t xml:space="preserve"> (0.00180 ± 0.00019), and </w:t>
       </w:r>
       <w:r>
         <w:rPr>
@@ -12710,7 +13538,7 @@
           <w:color w:val="222222"/>
           <w:sz w:val="19"/>
         </w:rPr>
-        <w:t>block_93</w:t>
+        <w:t>mean_daily_drop</w:t>
       </w:r>
       <w:r>
         <w:rPr>
@@ -12720,7 +13548,7 @@
           <w:color w:val="222222"/>
           <w:sz w:val="20"/>
         </w:rPr>
-        <w:t xml:space="preserve"> (0.000648 ± 0.001055). Figure 6 shows the top ten. The top features are consistent with the synthetic theft mechanism, which multiplies consumption by a factor below one: ratios and drop statistics are exactly the kind of signal the generator creates. This is evidence that the model uses plausible features on this benchmark, not evidence that the same features would dominate in real utility data.</w:t>
+        <w:t xml:space="preserve"> (0.00038 ± 0.00015). Figure 6 shows the top ten. The top features are consistent with the synthetic theft mechanism, which multiplies consumption by a factor below one: ratios and drop statistics are exactly the kind of signal the generator creates. This is evidence that the model uses plausible features on this benchmark, not evidence that the same features would dominate in real utility data.</w:t>
       </w:r>
     </w:p>
     <w:p>
@@ -12779,10 +13607,10 @@
         </w:tblCellMar>
       </w:tblPr>
       <w:tblGrid>
-        <w:gridCol w:w="867"/>
-        <w:gridCol w:w="2946"/>
-        <w:gridCol w:w="2946"/>
-        <w:gridCol w:w="3119"/>
+        <w:gridCol w:w="810"/>
+        <w:gridCol w:w="3401"/>
+        <w:gridCol w:w="2753"/>
+        <w:gridCol w:w="2915"/>
       </w:tblGrid>
       <w:tr>
         <w:trPr>
@@ -12791,7 +13619,7 @@
         </w:trPr>
         <w:tc>
           <w:tcPr>
-            <w:tcW w:type="dxa" w:w="867"/>
+            <w:tcW w:type="dxa" w:w="810"/>
             <w:vAlign w:val="center"/>
             <w:shd w:val="clear" w:color="auto" w:fill="1F3864"/>
           </w:tcPr>
@@ -12814,7 +13642,7 @@
         </w:tc>
         <w:tc>
           <w:tcPr>
-            <w:tcW w:type="dxa" w:w="2946"/>
+            <w:tcW w:type="dxa" w:w="3401"/>
             <w:vAlign w:val="center"/>
             <w:shd w:val="clear" w:color="auto" w:fill="1F3864"/>
           </w:tcPr>
@@ -12837,7 +13665,7 @@
         </w:tc>
         <w:tc>
           <w:tcPr>
-            <w:tcW w:type="dxa" w:w="2946"/>
+            <w:tcW w:type="dxa" w:w="2753"/>
             <w:vAlign w:val="center"/>
             <w:shd w:val="clear" w:color="auto" w:fill="1F3864"/>
           </w:tcPr>
@@ -12860,7 +13688,7 @@
         </w:tc>
         <w:tc>
           <w:tcPr>
-            <w:tcW w:type="dxa" w:w="3119"/>
+            <w:tcW w:type="dxa" w:w="2915"/>
             <w:vAlign w:val="center"/>
             <w:shd w:val="clear" w:color="auto" w:fill="1F3864"/>
           </w:tcPr>
@@ -12888,7 +13716,7 @@
         </w:trPr>
         <w:tc>
           <w:tcPr>
-            <w:tcW w:type="dxa" w:w="867"/>
+            <w:tcW w:type="dxa" w:w="810"/>
             <w:vAlign w:val="center"/>
           </w:tcPr>
           <w:p>
@@ -12910,7 +13738,7 @@
         </w:tc>
         <w:tc>
           <w:tcPr>
-            <w:tcW w:type="dxa" w:w="2946"/>
+            <w:tcW w:type="dxa" w:w="3401"/>
             <w:vAlign w:val="center"/>
           </w:tcPr>
           <w:p>
@@ -12932,7 +13760,7 @@
         </w:tc>
         <w:tc>
           <w:tcPr>
-            <w:tcW w:type="dxa" w:w="2946"/>
+            <w:tcW w:type="dxa" w:w="2753"/>
             <w:vAlign w:val="center"/>
           </w:tcPr>
           <w:p>
@@ -12948,13 +13776,13 @@
                 <w:color w:val="222222"/>
                 <w:sz w:val="16"/>
               </w:rPr>
-              <w:t>0.01159</w:t>
-            </w:r>
-          </w:p>
-        </w:tc>
-        <w:tc>
-          <w:tcPr>
-            <w:tcW w:type="dxa" w:w="3119"/>
+              <w:t>0.02010</w:t>
+            </w:r>
+          </w:p>
+        </w:tc>
+        <w:tc>
+          <w:tcPr>
+            <w:tcW w:type="dxa" w:w="2915"/>
             <w:vAlign w:val="center"/>
           </w:tcPr>
           <w:p>
@@ -12970,7 +13798,7 @@
                 <w:color w:val="222222"/>
                 <w:sz w:val="16"/>
               </w:rPr>
-              <w:t>0.00248</w:t>
+              <w:t>0.00275</w:t>
             </w:r>
           </w:p>
         </w:tc>
@@ -12981,7 +13809,7 @@
         </w:trPr>
         <w:tc>
           <w:tcPr>
-            <w:tcW w:type="dxa" w:w="867"/>
+            <w:tcW w:type="dxa" w:w="810"/>
             <w:vAlign w:val="center"/>
             <w:shd w:val="clear" w:color="auto" w:fill="F2F5F9"/>
           </w:tcPr>
@@ -13004,7 +13832,7 @@
         </w:tc>
         <w:tc>
           <w:tcPr>
-            <w:tcW w:type="dxa" w:w="2946"/>
+            <w:tcW w:type="dxa" w:w="3401"/>
             <w:vAlign w:val="center"/>
             <w:shd w:val="clear" w:color="auto" w:fill="F2F5F9"/>
           </w:tcPr>
@@ -13021,13 +13849,13 @@
                 <w:color w:val="222222"/>
                 <w:sz w:val="16"/>
               </w:rPr>
-              <w:t>max_daily_drop</w:t>
-            </w:r>
-          </w:p>
-        </w:tc>
-        <w:tc>
-          <w:tcPr>
-            <w:tcW w:type="dxa" w:w="2946"/>
+              <w:t>daily_diff_std</w:t>
+            </w:r>
+          </w:p>
+        </w:tc>
+        <w:tc>
+          <w:tcPr>
+            <w:tcW w:type="dxa" w:w="2753"/>
             <w:vAlign w:val="center"/>
             <w:shd w:val="clear" w:color="auto" w:fill="F2F5F9"/>
           </w:tcPr>
@@ -13044,13 +13872,13 @@
                 <w:color w:val="222222"/>
                 <w:sz w:val="16"/>
               </w:rPr>
-              <w:t>0.00704</w:t>
-            </w:r>
-          </w:p>
-        </w:tc>
-        <w:tc>
-          <w:tcPr>
-            <w:tcW w:type="dxa" w:w="3119"/>
+              <w:t>0.00899</w:t>
+            </w:r>
+          </w:p>
+        </w:tc>
+        <w:tc>
+          <w:tcPr>
+            <w:tcW w:type="dxa" w:w="2915"/>
             <w:vAlign w:val="center"/>
             <w:shd w:val="clear" w:color="auto" w:fill="F2F5F9"/>
           </w:tcPr>
@@ -13067,7 +13895,7 @@
                 <w:color w:val="222222"/>
                 <w:sz w:val="16"/>
               </w:rPr>
-              <w:t>0.00067</w:t>
+              <w:t>0.00099</w:t>
             </w:r>
           </w:p>
         </w:tc>
@@ -13078,7 +13906,7 @@
         </w:trPr>
         <w:tc>
           <w:tcPr>
-            <w:tcW w:type="dxa" w:w="867"/>
+            <w:tcW w:type="dxa" w:w="810"/>
             <w:vAlign w:val="center"/>
           </w:tcPr>
           <w:p>
@@ -13100,7 +13928,7 @@
         </w:tc>
         <w:tc>
           <w:tcPr>
-            <w:tcW w:type="dxa" w:w="2946"/>
+            <w:tcW w:type="dxa" w:w="3401"/>
             <w:vAlign w:val="center"/>
           </w:tcPr>
           <w:p>
@@ -13116,13 +13944,13 @@
                 <w:color w:val="222222"/>
                 <w:sz w:val="16"/>
               </w:rPr>
-              <w:t>daily_diff_std</w:t>
-            </w:r>
-          </w:p>
-        </w:tc>
-        <w:tc>
-          <w:tcPr>
-            <w:tcW w:type="dxa" w:w="2946"/>
+              <w:t>weekend_weekday_ratio</w:t>
+            </w:r>
+          </w:p>
+        </w:tc>
+        <w:tc>
+          <w:tcPr>
+            <w:tcW w:type="dxa" w:w="2753"/>
             <w:vAlign w:val="center"/>
           </w:tcPr>
           <w:p>
@@ -13138,13 +13966,13 @@
                 <w:color w:val="222222"/>
                 <w:sz w:val="16"/>
               </w:rPr>
-              <w:t>0.00487</w:t>
-            </w:r>
-          </w:p>
-        </w:tc>
-        <w:tc>
-          <w:tcPr>
-            <w:tcW w:type="dxa" w:w="3119"/>
+              <w:t>0.00306</w:t>
+            </w:r>
+          </w:p>
+        </w:tc>
+        <w:tc>
+          <w:tcPr>
+            <w:tcW w:type="dxa" w:w="2915"/>
             <w:vAlign w:val="center"/>
           </w:tcPr>
           <w:p>
@@ -13160,7 +13988,7 @@
                 <w:color w:val="222222"/>
                 <w:sz w:val="16"/>
               </w:rPr>
-              <w:t>0.00087</w:t>
+              <w:t>0.00272</w:t>
             </w:r>
           </w:p>
         </w:tc>
@@ -13171,7 +13999,7 @@
         </w:trPr>
         <w:tc>
           <w:tcPr>
-            <w:tcW w:type="dxa" w:w="867"/>
+            <w:tcW w:type="dxa" w:w="810"/>
             <w:vAlign w:val="center"/>
             <w:shd w:val="clear" w:color="auto" w:fill="F2F5F9"/>
           </w:tcPr>
@@ -13194,7 +14022,7 @@
         </w:tc>
         <w:tc>
           <w:tcPr>
-            <w:tcW w:type="dxa" w:w="2946"/>
+            <w:tcW w:type="dxa" w:w="3401"/>
             <w:vAlign w:val="center"/>
             <w:shd w:val="clear" w:color="auto" w:fill="F2F5F9"/>
           </w:tcPr>
@@ -13211,13 +14039,13 @@
                 <w:color w:val="222222"/>
                 <w:sz w:val="16"/>
               </w:rPr>
-              <w:t>mean_daily_drop</w:t>
-            </w:r>
-          </w:p>
-        </w:tc>
-        <w:tc>
-          <w:tcPr>
-            <w:tcW w:type="dxa" w:w="2946"/>
+              <w:t>max_daily_drop</w:t>
+            </w:r>
+          </w:p>
+        </w:tc>
+        <w:tc>
+          <w:tcPr>
+            <w:tcW w:type="dxa" w:w="2753"/>
             <w:vAlign w:val="center"/>
             <w:shd w:val="clear" w:color="auto" w:fill="F2F5F9"/>
           </w:tcPr>
@@ -13234,13 +14062,13 @@
                 <w:color w:val="222222"/>
                 <w:sz w:val="16"/>
               </w:rPr>
-              <w:t>0.000802</w:t>
-            </w:r>
-          </w:p>
-        </w:tc>
-        <w:tc>
-          <w:tcPr>
-            <w:tcW w:type="dxa" w:w="3119"/>
+              <w:t>0.00180</w:t>
+            </w:r>
+          </w:p>
+        </w:tc>
+        <w:tc>
+          <w:tcPr>
+            <w:tcW w:type="dxa" w:w="2915"/>
             <w:vAlign w:val="center"/>
             <w:shd w:val="clear" w:color="auto" w:fill="F2F5F9"/>
           </w:tcPr>
@@ -13257,7 +14085,7 @@
                 <w:color w:val="222222"/>
                 <w:sz w:val="16"/>
               </w:rPr>
-              <w:t>0.000236</w:t>
+              <w:t>0.00019</w:t>
             </w:r>
           </w:p>
         </w:tc>
@@ -13268,7 +14096,7 @@
         </w:trPr>
         <w:tc>
           <w:tcPr>
-            <w:tcW w:type="dxa" w:w="867"/>
+            <w:tcW w:type="dxa" w:w="810"/>
             <w:vAlign w:val="center"/>
           </w:tcPr>
           <w:p>
@@ -13290,7 +14118,7 @@
         </w:tc>
         <w:tc>
           <w:tcPr>
-            <w:tcW w:type="dxa" w:w="2946"/>
+            <w:tcW w:type="dxa" w:w="3401"/>
             <w:vAlign w:val="center"/>
           </w:tcPr>
           <w:p>
@@ -13306,13 +14134,13 @@
                 <w:color w:val="222222"/>
                 <w:sz w:val="16"/>
               </w:rPr>
-              <w:t>block_93</w:t>
-            </w:r>
-          </w:p>
-        </w:tc>
-        <w:tc>
-          <w:tcPr>
-            <w:tcW w:type="dxa" w:w="2946"/>
+              <w:t>mean_daily_drop</w:t>
+            </w:r>
+          </w:p>
+        </w:tc>
+        <w:tc>
+          <w:tcPr>
+            <w:tcW w:type="dxa" w:w="2753"/>
             <w:vAlign w:val="center"/>
           </w:tcPr>
           <w:p>
@@ -13328,13 +14156,13 @@
                 <w:color w:val="222222"/>
                 <w:sz w:val="16"/>
               </w:rPr>
-              <w:t>0.000648</w:t>
-            </w:r>
-          </w:p>
-        </w:tc>
-        <w:tc>
-          <w:tcPr>
-            <w:tcW w:type="dxa" w:w="3119"/>
+              <w:t>0.00038</w:t>
+            </w:r>
+          </w:p>
+        </w:tc>
+        <w:tc>
+          <w:tcPr>
+            <w:tcW w:type="dxa" w:w="2915"/>
             <w:vAlign w:val="center"/>
           </w:tcPr>
           <w:p>
@@ -13350,7 +14178,7 @@
                 <w:color w:val="222222"/>
                 <w:sz w:val="16"/>
               </w:rPr>
-              <w:t>0.001055</w:t>
+              <w:t>0.00015</w:t>
             </w:r>
           </w:p>
         </w:tc>
@@ -13361,7 +14189,7 @@
         </w:trPr>
         <w:tc>
           <w:tcPr>
-            <w:tcW w:type="dxa" w:w="867"/>
+            <w:tcW w:type="dxa" w:w="810"/>
             <w:vAlign w:val="center"/>
             <w:shd w:val="clear" w:color="auto" w:fill="F2F5F9"/>
           </w:tcPr>
@@ -13384,7 +14212,7 @@
         </w:tc>
         <w:tc>
           <w:tcPr>
-            <w:tcW w:type="dxa" w:w="2946"/>
+            <w:tcW w:type="dxa" w:w="3401"/>
             <w:vAlign w:val="center"/>
             <w:shd w:val="clear" w:color="auto" w:fill="F2F5F9"/>
           </w:tcPr>
@@ -13407,7 +14235,7 @@
         </w:tc>
         <w:tc>
           <w:tcPr>
-            <w:tcW w:type="dxa" w:w="2946"/>
+            <w:tcW w:type="dxa" w:w="2753"/>
             <w:vAlign w:val="center"/>
             <w:shd w:val="clear" w:color="auto" w:fill="F2F5F9"/>
           </w:tcPr>
@@ -13430,7 +14258,7 @@
         </w:tc>
         <w:tc>
           <w:tcPr>
-            <w:tcW w:type="dxa" w:w="3119"/>
+            <w:tcW w:type="dxa" w:w="2915"/>
             <w:vAlign w:val="center"/>
             <w:shd w:val="clear" w:color="auto" w:fill="F2F5F9"/>
           </w:tcPr>
@@ -13458,7 +14286,7 @@
         </w:trPr>
         <w:tc>
           <w:tcPr>
-            <w:tcW w:type="dxa" w:w="867"/>
+            <w:tcW w:type="dxa" w:w="810"/>
             <w:vAlign w:val="center"/>
           </w:tcPr>
           <w:p>
@@ -13480,7 +14308,7 @@
         </w:tc>
         <w:tc>
           <w:tcPr>
-            <w:tcW w:type="dxa" w:w="2946"/>
+            <w:tcW w:type="dxa" w:w="3401"/>
             <w:vAlign w:val="center"/>
           </w:tcPr>
           <w:p>
@@ -13502,7 +14330,7 @@
         </w:tc>
         <w:tc>
           <w:tcPr>
-            <w:tcW w:type="dxa" w:w="2946"/>
+            <w:tcW w:type="dxa" w:w="2753"/>
             <w:vAlign w:val="center"/>
           </w:tcPr>
           <w:p>
@@ -13524,7 +14352,7 @@
         </w:tc>
         <w:tc>
           <w:tcPr>
-            <w:tcW w:type="dxa" w:w="3119"/>
+            <w:tcW w:type="dxa" w:w="2915"/>
             <w:vAlign w:val="center"/>
           </w:tcPr>
           <w:p>
@@ -13551,7 +14379,7 @@
         </w:trPr>
         <w:tc>
           <w:tcPr>
-            <w:tcW w:type="dxa" w:w="867"/>
+            <w:tcW w:type="dxa" w:w="810"/>
             <w:vAlign w:val="center"/>
             <w:shd w:val="clear" w:color="auto" w:fill="F2F5F9"/>
           </w:tcPr>
@@ -13574,7 +14402,7 @@
         </w:tc>
         <w:tc>
           <w:tcPr>
-            <w:tcW w:type="dxa" w:w="2946"/>
+            <w:tcW w:type="dxa" w:w="3401"/>
             <w:vAlign w:val="center"/>
             <w:shd w:val="clear" w:color="auto" w:fill="F2F5F9"/>
           </w:tcPr>
@@ -13597,7 +14425,7 @@
         </w:tc>
         <w:tc>
           <w:tcPr>
-            <w:tcW w:type="dxa" w:w="2946"/>
+            <w:tcW w:type="dxa" w:w="2753"/>
             <w:vAlign w:val="center"/>
             <w:shd w:val="clear" w:color="auto" w:fill="F2F5F9"/>
           </w:tcPr>
@@ -13620,7 +14448,7 @@
         </w:tc>
         <w:tc>
           <w:tcPr>
-            <w:tcW w:type="dxa" w:w="3119"/>
+            <w:tcW w:type="dxa" w:w="2915"/>
             <w:vAlign w:val="center"/>
             <w:shd w:val="clear" w:color="auto" w:fill="F2F5F9"/>
           </w:tcPr>
@@ -13648,7 +14476,7 @@
         </w:trPr>
         <w:tc>
           <w:tcPr>
-            <w:tcW w:type="dxa" w:w="867"/>
+            <w:tcW w:type="dxa" w:w="810"/>
             <w:vAlign w:val="center"/>
           </w:tcPr>
           <w:p>
@@ -13670,7 +14498,7 @@
         </w:tc>
         <w:tc>
           <w:tcPr>
-            <w:tcW w:type="dxa" w:w="2946"/>
+            <w:tcW w:type="dxa" w:w="3401"/>
             <w:vAlign w:val="center"/>
           </w:tcPr>
           <w:p>
@@ -13692,7 +14520,7 @@
         </w:tc>
         <w:tc>
           <w:tcPr>
-            <w:tcW w:type="dxa" w:w="2946"/>
+            <w:tcW w:type="dxa" w:w="2753"/>
             <w:vAlign w:val="center"/>
           </w:tcPr>
           <w:p>
@@ -13714,7 +14542,7 @@
         </w:tc>
         <w:tc>
           <w:tcPr>
-            <w:tcW w:type="dxa" w:w="3119"/>
+            <w:tcW w:type="dxa" w:w="2915"/>
             <w:vAlign w:val="center"/>
           </w:tcPr>
           <w:p>
@@ -13741,7 +14569,7 @@
         </w:trPr>
         <w:tc>
           <w:tcPr>
-            <w:tcW w:type="dxa" w:w="867"/>
+            <w:tcW w:type="dxa" w:w="810"/>
             <w:vAlign w:val="center"/>
             <w:shd w:val="clear" w:color="auto" w:fill="F2F5F9"/>
           </w:tcPr>
@@ -13764,7 +14592,7 @@
         </w:tc>
         <w:tc>
           <w:tcPr>
-            <w:tcW w:type="dxa" w:w="2946"/>
+            <w:tcW w:type="dxa" w:w="3401"/>
             <w:vAlign w:val="center"/>
             <w:shd w:val="clear" w:color="auto" w:fill="F2F5F9"/>
           </w:tcPr>
@@ -13787,7 +14615,7 @@
         </w:tc>
         <w:tc>
           <w:tcPr>
-            <w:tcW w:type="dxa" w:w="2946"/>
+            <w:tcW w:type="dxa" w:w="2753"/>
             <w:vAlign w:val="center"/>
             <w:shd w:val="clear" w:color="auto" w:fill="F2F5F9"/>
           </w:tcPr>
@@ -13810,7 +14638,7 @@
         </w:tc>
         <w:tc>
           <w:tcPr>
-            <w:tcW w:type="dxa" w:w="3119"/>
+            <w:tcW w:type="dxa" w:w="2915"/>
             <w:vAlign w:val="center"/>
             <w:shd w:val="clear" w:color="auto" w:fill="F2F5F9"/>
           </w:tcPr>
@@ -13993,14 +14821,14 @@
         </w:tblCellMar>
       </w:tblPr>
       <w:tblGrid>
-        <w:gridCol w:w="1844"/>
-        <w:gridCol w:w="1054"/>
-        <w:gridCol w:w="1185"/>
-        <w:gridCol w:w="790"/>
-        <w:gridCol w:w="790"/>
-        <w:gridCol w:w="922"/>
-        <w:gridCol w:w="790"/>
-        <w:gridCol w:w="2503"/>
+        <w:gridCol w:w="1796"/>
+        <w:gridCol w:w="1026"/>
+        <w:gridCol w:w="1155"/>
+        <w:gridCol w:w="770"/>
+        <w:gridCol w:w="770"/>
+        <w:gridCol w:w="898"/>
+        <w:gridCol w:w="770"/>
+        <w:gridCol w:w="2694"/>
       </w:tblGrid>
       <w:tr>
         <w:trPr>
@@ -14009,7 +14837,7 @@
         </w:trPr>
         <w:tc>
           <w:tcPr>
-            <w:tcW w:type="dxa" w:w="1844"/>
+            <w:tcW w:type="dxa" w:w="1796"/>
             <w:vAlign w:val="center"/>
             <w:shd w:val="clear" w:color="auto" w:fill="1F3864"/>
           </w:tcPr>
@@ -14032,7 +14860,7 @@
         </w:tc>
         <w:tc>
           <w:tcPr>
-            <w:tcW w:type="dxa" w:w="1054"/>
+            <w:tcW w:type="dxa" w:w="1026"/>
             <w:vAlign w:val="center"/>
             <w:shd w:val="clear" w:color="auto" w:fill="1F3864"/>
           </w:tcPr>
@@ -14055,7 +14883,7 @@
         </w:tc>
         <w:tc>
           <w:tcPr>
-            <w:tcW w:type="dxa" w:w="1185"/>
+            <w:tcW w:type="dxa" w:w="1155"/>
             <w:vAlign w:val="center"/>
             <w:shd w:val="clear" w:color="auto" w:fill="1F3864"/>
           </w:tcPr>
@@ -14078,7 +14906,7 @@
         </w:tc>
         <w:tc>
           <w:tcPr>
-            <w:tcW w:type="dxa" w:w="790"/>
+            <w:tcW w:type="dxa" w:w="770"/>
             <w:vAlign w:val="center"/>
             <w:shd w:val="clear" w:color="auto" w:fill="1F3864"/>
           </w:tcPr>
@@ -14101,7 +14929,7 @@
         </w:tc>
         <w:tc>
           <w:tcPr>
-            <w:tcW w:type="dxa" w:w="790"/>
+            <w:tcW w:type="dxa" w:w="770"/>
             <w:vAlign w:val="center"/>
             <w:shd w:val="clear" w:color="auto" w:fill="1F3864"/>
           </w:tcPr>
@@ -14124,7 +14952,7 @@
         </w:tc>
         <w:tc>
           <w:tcPr>
-            <w:tcW w:type="dxa" w:w="922"/>
+            <w:tcW w:type="dxa" w:w="898"/>
             <w:vAlign w:val="center"/>
             <w:shd w:val="clear" w:color="auto" w:fill="1F3864"/>
           </w:tcPr>
@@ -14147,7 +14975,7 @@
         </w:tc>
         <w:tc>
           <w:tcPr>
-            <w:tcW w:type="dxa" w:w="790"/>
+            <w:tcW w:type="dxa" w:w="770"/>
             <w:vAlign w:val="center"/>
             <w:shd w:val="clear" w:color="auto" w:fill="1F3864"/>
           </w:tcPr>
@@ -14170,7 +14998,7 @@
         </w:tc>
         <w:tc>
           <w:tcPr>
-            <w:tcW w:type="dxa" w:w="2503"/>
+            <w:tcW w:type="dxa" w:w="2694"/>
             <w:vAlign w:val="center"/>
             <w:shd w:val="clear" w:color="auto" w:fill="1F3864"/>
           </w:tcPr>
@@ -14198,7 +15026,7 @@
         </w:trPr>
         <w:tc>
           <w:tcPr>
-            <w:tcW w:type="dxa" w:w="1844"/>
+            <w:tcW w:type="dxa" w:w="1796"/>
             <w:vAlign w:val="center"/>
           </w:tcPr>
           <w:p>
@@ -14220,7 +15048,7 @@
         </w:tc>
         <w:tc>
           <w:tcPr>
-            <w:tcW w:type="dxa" w:w="1054"/>
+            <w:tcW w:type="dxa" w:w="1026"/>
             <w:vAlign w:val="center"/>
           </w:tcPr>
           <w:p>
@@ -14242,7 +15070,7 @@
         </w:tc>
         <w:tc>
           <w:tcPr>
-            <w:tcW w:type="dxa" w:w="1185"/>
+            <w:tcW w:type="dxa" w:w="1155"/>
             <w:vAlign w:val="center"/>
           </w:tcPr>
           <w:p>
@@ -14264,7 +15092,7 @@
         </w:tc>
         <w:tc>
           <w:tcPr>
-            <w:tcW w:type="dxa" w:w="790"/>
+            <w:tcW w:type="dxa" w:w="770"/>
             <w:vAlign w:val="center"/>
           </w:tcPr>
           <w:p>
@@ -14280,13 +15108,13 @@
                 <w:color w:val="222222"/>
                 <w:sz w:val="16"/>
               </w:rPr>
-              <w:t>0.9877</w:t>
-            </w:r>
-          </w:p>
-        </w:tc>
-        <w:tc>
-          <w:tcPr>
-            <w:tcW w:type="dxa" w:w="790"/>
+              <w:t>0.9683</w:t>
+            </w:r>
+          </w:p>
+        </w:tc>
+        <w:tc>
+          <w:tcPr>
+            <w:tcW w:type="dxa" w:w="770"/>
             <w:vAlign w:val="center"/>
           </w:tcPr>
           <w:p>
@@ -14302,13 +15130,13 @@
                 <w:color w:val="222222"/>
                 <w:sz w:val="16"/>
               </w:rPr>
-              <w:t>0.9938</w:t>
-            </w:r>
-          </w:p>
-        </w:tc>
-        <w:tc>
-          <w:tcPr>
-            <w:tcW w:type="dxa" w:w="922"/>
+              <w:t>0.9839</w:t>
+            </w:r>
+          </w:p>
+        </w:tc>
+        <w:tc>
+          <w:tcPr>
+            <w:tcW w:type="dxa" w:w="898"/>
             <w:vAlign w:val="center"/>
           </w:tcPr>
           <w:p>
@@ -14324,13 +15152,13 @@
                 <w:color w:val="222222"/>
                 <w:sz w:val="16"/>
               </w:rPr>
-              <w:t>0.9973</w:t>
-            </w:r>
-          </w:p>
-        </w:tc>
-        <w:tc>
-          <w:tcPr>
-            <w:tcW w:type="dxa" w:w="790"/>
+              <w:t>0.9888</w:t>
+            </w:r>
+          </w:p>
+        </w:tc>
+        <w:tc>
+          <w:tcPr>
+            <w:tcW w:type="dxa" w:w="770"/>
             <w:vAlign w:val="center"/>
           </w:tcPr>
           <w:p>
@@ -14346,13 +15174,13 @@
                 <w:color w:val="222222"/>
                 <w:sz w:val="16"/>
               </w:rPr>
-              <w:t>0.9927</w:t>
-            </w:r>
-          </w:p>
-        </w:tc>
-        <w:tc>
-          <w:tcPr>
-            <w:tcW w:type="dxa" w:w="2503"/>
+              <w:t>0.9775</w:t>
+            </w:r>
+          </w:p>
+        </w:tc>
+        <w:tc>
+          <w:tcPr>
+            <w:tcW w:type="dxa" w:w="2694"/>
             <w:vAlign w:val="center"/>
           </w:tcPr>
           <w:p>
@@ -14368,7 +15196,7 @@
                 <w:color w:val="222222"/>
                 <w:sz w:val="16"/>
               </w:rPr>
-              <w:t>160 / 0 / 2,526 / 2</w:t>
+              <w:t>826 / 0 / 13,307 / 27</w:t>
             </w:r>
           </w:p>
         </w:tc>
@@ -14379,7 +15207,7 @@
         </w:trPr>
         <w:tc>
           <w:tcPr>
-            <w:tcW w:type="dxa" w:w="1844"/>
+            <w:tcW w:type="dxa" w:w="1796"/>
             <w:vAlign w:val="center"/>
             <w:shd w:val="clear" w:color="auto" w:fill="F2F5F9"/>
           </w:tcPr>
@@ -14402,7 +15230,7 @@
         </w:tc>
         <w:tc>
           <w:tcPr>
-            <w:tcW w:type="dxa" w:w="1054"/>
+            <w:tcW w:type="dxa" w:w="1026"/>
             <w:vAlign w:val="center"/>
             <w:shd w:val="clear" w:color="auto" w:fill="F2F5F9"/>
           </w:tcPr>
@@ -14425,7 +15253,7 @@
         </w:tc>
         <w:tc>
           <w:tcPr>
-            <w:tcW w:type="dxa" w:w="1185"/>
+            <w:tcW w:type="dxa" w:w="1155"/>
             <w:vAlign w:val="center"/>
             <w:shd w:val="clear" w:color="auto" w:fill="F2F5F9"/>
           </w:tcPr>
@@ -14448,7 +15276,7 @@
         </w:tc>
         <w:tc>
           <w:tcPr>
-            <w:tcW w:type="dxa" w:w="790"/>
+            <w:tcW w:type="dxa" w:w="770"/>
             <w:vAlign w:val="center"/>
             <w:shd w:val="clear" w:color="auto" w:fill="F2F5F9"/>
           </w:tcPr>
@@ -14465,13 +15293,13 @@
                 <w:color w:val="222222"/>
                 <w:sz w:val="16"/>
               </w:rPr>
-              <w:t>0.9938</w:t>
-            </w:r>
-          </w:p>
-        </w:tc>
-        <w:tc>
-          <w:tcPr>
-            <w:tcW w:type="dxa" w:w="790"/>
+              <w:t>0.9578</w:t>
+            </w:r>
+          </w:p>
+        </w:tc>
+        <w:tc>
+          <w:tcPr>
+            <w:tcW w:type="dxa" w:w="770"/>
             <w:vAlign w:val="center"/>
             <w:shd w:val="clear" w:color="auto" w:fill="F2F5F9"/>
           </w:tcPr>
@@ -14488,13 +15316,13 @@
                 <w:color w:val="222222"/>
                 <w:sz w:val="16"/>
               </w:rPr>
-              <w:t>0.9969</w:t>
-            </w:r>
-          </w:p>
-        </w:tc>
-        <w:tc>
-          <w:tcPr>
-            <w:tcW w:type="dxa" w:w="922"/>
+              <w:t>0.9784</w:t>
+            </w:r>
+          </w:p>
+        </w:tc>
+        <w:tc>
+          <w:tcPr>
+            <w:tcW w:type="dxa" w:w="898"/>
             <w:vAlign w:val="center"/>
             <w:shd w:val="clear" w:color="auto" w:fill="F2F5F9"/>
           </w:tcPr>
@@ -14511,13 +15339,13 @@
                 <w:color w:val="222222"/>
                 <w:sz w:val="16"/>
               </w:rPr>
-              <w:t>0.9969</w:t>
-            </w:r>
-          </w:p>
-        </w:tc>
-        <w:tc>
-          <w:tcPr>
-            <w:tcW w:type="dxa" w:w="790"/>
+              <w:t>0.9866</w:t>
+            </w:r>
+          </w:p>
+        </w:tc>
+        <w:tc>
+          <w:tcPr>
+            <w:tcW w:type="dxa" w:w="770"/>
             <w:vAlign w:val="center"/>
             <w:shd w:val="clear" w:color="auto" w:fill="F2F5F9"/>
           </w:tcPr>
@@ -14534,13 +15362,13 @@
                 <w:color w:val="222222"/>
                 <w:sz w:val="16"/>
               </w:rPr>
-              <w:t>0.9945</w:t>
-            </w:r>
-          </w:p>
-        </w:tc>
-        <w:tc>
-          <w:tcPr>
-            <w:tcW w:type="dxa" w:w="2503"/>
+              <w:t>0.9747</w:t>
+            </w:r>
+          </w:p>
+        </w:tc>
+        <w:tc>
+          <w:tcPr>
+            <w:tcW w:type="dxa" w:w="2694"/>
             <w:vAlign w:val="center"/>
             <w:shd w:val="clear" w:color="auto" w:fill="F2F5F9"/>
           </w:tcPr>
@@ -14557,7 +15385,7 @@
                 <w:color w:val="222222"/>
                 <w:sz w:val="16"/>
               </w:rPr>
-              <w:t>161 / 0 / 2,526 / 1</w:t>
+              <w:t>817 / 0 / 13,307 / 36</w:t>
             </w:r>
           </w:p>
         </w:tc>
@@ -14568,7 +15396,7 @@
         </w:trPr>
         <w:tc>
           <w:tcPr>
-            <w:tcW w:type="dxa" w:w="1844"/>
+            <w:tcW w:type="dxa" w:w="1796"/>
             <w:vAlign w:val="center"/>
           </w:tcPr>
           <w:p>
@@ -14590,7 +15418,7 @@
         </w:tc>
         <w:tc>
           <w:tcPr>
-            <w:tcW w:type="dxa" w:w="1054"/>
+            <w:tcW w:type="dxa" w:w="1026"/>
             <w:vAlign w:val="center"/>
           </w:tcPr>
           <w:p>
@@ -14612,7 +15440,7 @@
         </w:tc>
         <w:tc>
           <w:tcPr>
-            <w:tcW w:type="dxa" w:w="1185"/>
+            <w:tcW w:type="dxa" w:w="1155"/>
             <w:vAlign w:val="center"/>
           </w:tcPr>
           <w:p>
@@ -14634,7 +15462,7 @@
         </w:tc>
         <w:tc>
           <w:tcPr>
-            <w:tcW w:type="dxa" w:w="790"/>
+            <w:tcW w:type="dxa" w:w="770"/>
             <w:vAlign w:val="center"/>
           </w:tcPr>
           <w:p>
@@ -14650,13 +15478,13 @@
                 <w:color w:val="222222"/>
                 <w:sz w:val="16"/>
               </w:rPr>
-              <w:t>0.1429</w:t>
-            </w:r>
-          </w:p>
-        </w:tc>
-        <w:tc>
-          <w:tcPr>
-            <w:tcW w:type="dxa" w:w="790"/>
+              <w:t>0.5714</w:t>
+            </w:r>
+          </w:p>
+        </w:tc>
+        <w:tc>
+          <w:tcPr>
+            <w:tcW w:type="dxa" w:w="770"/>
             <w:vAlign w:val="center"/>
           </w:tcPr>
           <w:p>
@@ -14672,13 +15500,13 @@
                 <w:color w:val="222222"/>
                 <w:sz w:val="16"/>
               </w:rPr>
-              <w:t>0.2500</w:t>
-            </w:r>
-          </w:p>
-        </w:tc>
-        <w:tc>
-          <w:tcPr>
-            <w:tcW w:type="dxa" w:w="922"/>
+              <w:t>0.7273</w:t>
+            </w:r>
+          </w:p>
+        </w:tc>
+        <w:tc>
+          <w:tcPr>
+            <w:tcW w:type="dxa" w:w="898"/>
             <w:vAlign w:val="center"/>
           </w:tcPr>
           <w:p>
@@ -14700,7 +15528,7 @@
         </w:tc>
         <w:tc>
           <w:tcPr>
-            <w:tcW w:type="dxa" w:w="790"/>
+            <w:tcW w:type="dxa" w:w="770"/>
             <w:vAlign w:val="center"/>
           </w:tcPr>
           <w:p>
@@ -14722,7 +15550,7 @@
         </w:tc>
         <w:tc>
           <w:tcPr>
-            <w:tcW w:type="dxa" w:w="2503"/>
+            <w:tcW w:type="dxa" w:w="2694"/>
             <w:vAlign w:val="center"/>
           </w:tcPr>
           <w:p>
@@ -14738,7 +15566,7 @@
                 <w:color w:val="222222"/>
                 <w:sz w:val="16"/>
               </w:rPr>
-              <w:t>1 / 0 / 41 / 6</w:t>
+              <w:t>8 / 0 / 106 / 6</w:t>
             </w:r>
           </w:p>
         </w:tc>
@@ -14749,7 +15577,7 @@
         </w:trPr>
         <w:tc>
           <w:tcPr>
-            <w:tcW w:type="dxa" w:w="1844"/>
+            <w:tcW w:type="dxa" w:w="1796"/>
             <w:vAlign w:val="center"/>
             <w:shd w:val="clear" w:color="auto" w:fill="F2F5F9"/>
           </w:tcPr>
@@ -14772,7 +15600,7 @@
         </w:tc>
         <w:tc>
           <w:tcPr>
-            <w:tcW w:type="dxa" w:w="1054"/>
+            <w:tcW w:type="dxa" w:w="1026"/>
             <w:vAlign w:val="center"/>
             <w:shd w:val="clear" w:color="auto" w:fill="F2F5F9"/>
           </w:tcPr>
@@ -14795,7 +15623,7 @@
         </w:tc>
         <w:tc>
           <w:tcPr>
-            <w:tcW w:type="dxa" w:w="1185"/>
+            <w:tcW w:type="dxa" w:w="1155"/>
             <w:vAlign w:val="center"/>
             <w:shd w:val="clear" w:color="auto" w:fill="F2F5F9"/>
           </w:tcPr>
@@ -14818,7 +15646,7 @@
         </w:tc>
         <w:tc>
           <w:tcPr>
-            <w:tcW w:type="dxa" w:w="790"/>
+            <w:tcW w:type="dxa" w:w="770"/>
             <w:vAlign w:val="center"/>
             <w:shd w:val="clear" w:color="auto" w:fill="F2F5F9"/>
           </w:tcPr>
@@ -14835,13 +15663,13 @@
                 <w:color w:val="222222"/>
                 <w:sz w:val="16"/>
               </w:rPr>
-              <w:t>0.1429</w:t>
-            </w:r>
-          </w:p>
-        </w:tc>
-        <w:tc>
-          <w:tcPr>
-            <w:tcW w:type="dxa" w:w="790"/>
+              <w:t>0.5000</w:t>
+            </w:r>
+          </w:p>
+        </w:tc>
+        <w:tc>
+          <w:tcPr>
+            <w:tcW w:type="dxa" w:w="770"/>
             <w:vAlign w:val="center"/>
             <w:shd w:val="clear" w:color="auto" w:fill="F2F5F9"/>
           </w:tcPr>
@@ -14858,13 +15686,13 @@
                 <w:color w:val="222222"/>
                 <w:sz w:val="16"/>
               </w:rPr>
-              <w:t>0.2500</w:t>
-            </w:r>
-          </w:p>
-        </w:tc>
-        <w:tc>
-          <w:tcPr>
-            <w:tcW w:type="dxa" w:w="922"/>
+              <w:t>0.6667</w:t>
+            </w:r>
+          </w:p>
+        </w:tc>
+        <w:tc>
+          <w:tcPr>
+            <w:tcW w:type="dxa" w:w="898"/>
             <w:vAlign w:val="center"/>
             <w:shd w:val="clear" w:color="auto" w:fill="F2F5F9"/>
           </w:tcPr>
@@ -14887,7 +15715,7 @@
         </w:tc>
         <w:tc>
           <w:tcPr>
-            <w:tcW w:type="dxa" w:w="790"/>
+            <w:tcW w:type="dxa" w:w="770"/>
             <w:vAlign w:val="center"/>
             <w:shd w:val="clear" w:color="auto" w:fill="F2F5F9"/>
           </w:tcPr>
@@ -14910,7 +15738,7 @@
         </w:tc>
         <w:tc>
           <w:tcPr>
-            <w:tcW w:type="dxa" w:w="2503"/>
+            <w:tcW w:type="dxa" w:w="2694"/>
             <w:vAlign w:val="center"/>
             <w:shd w:val="clear" w:color="auto" w:fill="F2F5F9"/>
           </w:tcPr>
@@ -14927,7 +15755,7 @@
                 <w:color w:val="222222"/>
                 <w:sz w:val="16"/>
               </w:rPr>
-              <w:t>1 / 0 / 41 / 6</w:t>
+              <w:t>7 / 0 / 106 / 7</w:t>
             </w:r>
           </w:p>
         </w:tc>
@@ -14963,7 +15791,7 @@
       <w:r>
         <w:drawing>
           <wp:inline xmlns:a="http://schemas.openxmlformats.org/drawingml/2006/main" xmlns:pic="http://schemas.openxmlformats.org/drawingml/2006/picture">
-            <wp:extent cx="5486400" cy="2510208"/>
+            <wp:extent cx="5486400" cy="2423227"/>
             <wp:docPr id="7" name="Picture 7"/>
             <wp:cNvGraphicFramePr>
               <a:graphicFrameLocks noChangeAspect="1"/>
@@ -14984,7 +15812,7 @@
                   <pic:spPr>
                     <a:xfrm>
                       <a:off x="0" y="0"/>
-                      <a:ext cx="5486400" cy="2510208"/>
+                      <a:ext cx="5486400" cy="2423227"/>
                     </a:xfrm>
                     <a:prstGeom prst="rect"/>
                   </pic:spPr>
@@ -15644,7 +16472,7 @@
           <w:color w:val="222222"/>
           <w:sz w:val="20"/>
         </w:rPr>
-        <w:t>NOT RUN</w:t>
+        <w:t>EXECUTED</w:t>
       </w:r>
       <w:r>
         <w:rPr>
@@ -15654,7 +16482,7 @@
           <w:color w:val="222222"/>
           <w:sz w:val="20"/>
         </w:rPr>
-        <w:t>. The results should not be generalized to real utilities, real non-IID populations, or production communication networks.</w:t>
+        <w:t>. The results should still not be generalized to real utilities, real non-IID populations, or production communication networks.</w:t>
       </w:r>
     </w:p>
     <w:p>
@@ -15927,7 +16755,7 @@
                 <w:color w:val="222222"/>
                 <w:sz w:val="16"/>
               </w:rPr>
-              <w:t>PowerShield-FL window F1 = 0.9969</w:t>
+              <w:t>PowerShield-FL window F1 = 0.9802 ± 0.0090</w:t>
             </w:r>
           </w:p>
         </w:tc>
@@ -15950,7 +16778,7 @@
                 <w:color w:val="222222"/>
                 <w:sz w:val="16"/>
               </w:rPr>
-              <w:t>Held-out test windows; seed 42</w:t>
+              <w:t>Held-out test windows; 3 seeds</w:t>
             </w:r>
           </w:p>
         </w:tc>
@@ -16000,7 +16828,7 @@
                 <w:color w:val="222222"/>
                 <w:sz w:val="16"/>
               </w:rPr>
-              <w:t>+0.0031 F1 over FedAvg</w:t>
+              <w:t>FedAvg − PowerShield +0.0021 F1</w:t>
             </w:r>
           </w:p>
         </w:tc>
@@ -16022,7 +16850,7 @@
                 <w:color w:val="222222"/>
                 <w:sz w:val="16"/>
               </w:rPr>
-              <w:t>TP 160→161; FN 2→1; one window</w:t>
+              <w:t>3 seeds; paired t p = 0.4038</w:t>
             </w:r>
           </w:p>
         </w:tc>
@@ -16072,7 +16900,7 @@
                 <w:color w:val="222222"/>
                 <w:sz w:val="16"/>
               </w:rPr>
-              <w:t>Matches centralized Random Forest F1</w:t>
+              <w:t>Competitive with centralized lightweight MLP (0.9839)</w:t>
             </w:r>
           </w:p>
         </w:tc>
@@ -16095,7 +16923,7 @@
                 <w:color w:val="222222"/>
                 <w:sz w:val="16"/>
               </w:rPr>
-              <w:t>Both 0.9969; different training regimes</w:t>
+              <w:t>Different training regimes</w:t>
             </w:r>
           </w:p>
         </w:tc>
@@ -16479,7 +17307,7 @@
                 <w:color w:val="222222"/>
                 <w:sz w:val="16"/>
               </w:rPr>
-              <w:t>NOT RUN</w:t>
+              <w:t>EXECUTED</w:t>
             </w:r>
           </w:p>
         </w:tc>
@@ -16602,7 +17430,7 @@
                 <w:color w:val="222222"/>
                 <w:sz w:val="16"/>
               </w:rPr>
-              <w:t>One seed; no paired test</w:t>
+              <w:t>3 seeds; paired t p = 0.4038; Wilcoxon p = 0.5</w:t>
             </w:r>
           </w:p>
         </w:tc>
@@ -16624,7 +17452,7 @@
                 <w:color w:val="222222"/>
                 <w:sz w:val="16"/>
               </w:rPr>
-              <w:t>STATISTICAL TEST NOT RUN</w:t>
+              <w:t>NOT SIGNIFICANT</w:t>
             </w:r>
           </w:p>
         </w:tc>
@@ -16726,7 +17554,7 @@
           <w:color w:val="222222"/>
           <w:sz w:val="20"/>
         </w:rPr>
-        <w:t>Single seed.</w:t>
+        <w:t>Three seeds.</w:t>
       </w:r>
       <w:r>
         <w:rPr>
@@ -16736,7 +17564,7 @@
           <w:color w:val="222222"/>
           <w:sz w:val="20"/>
         </w:rPr>
-        <w:t xml:space="preserve"> The main run uses seed 42. There are no seed-to-seed confidence intervals or significance tests. The +0.0031 F1 difference is a point estimate from one run.</w:t>
+        <w:t xml:space="preserve"> The main run uses seeds [42, 123, 2026], with paired tests reported. The F1 difference is not statistically significant (paired t p = 0.4038).</w:t>
       </w:r>
     </w:p>
     <w:p>
@@ -16761,7 +17589,7 @@
           <w:color w:val="222222"/>
           <w:sz w:val="20"/>
         </w:rPr>
-        <w:t>Short training.</w:t>
+        <w:t>Shorter sweeps.</w:t>
       </w:r>
       <w:r>
         <w:rPr>
@@ -16771,7 +17599,7 @@
           <w:color w:val="222222"/>
           <w:sz w:val="20"/>
         </w:rPr>
-        <w:t xml:space="preserve"> The main run uses eight rounds and two local epochs. The sweeps use four rounds. This is appropriate for a CPU quick mode but not for a converged FL study.</w:t>
+        <w:t xml:space="preserve"> The main run uses 25 rounds, but the sweeps use four rounds and are not directly comparable in absolute F1 to the main run.</w:t>
       </w:r>
     </w:p>
     <w:p>
@@ -16796,7 +17624,7 @@
           <w:color w:val="222222"/>
           <w:sz w:val="20"/>
         </w:rPr>
-        <w:t>No full mode.</w:t>
+        <w:t>Full mode executed.</w:t>
       </w:r>
       <w:r>
         <w:rPr>
@@ -16816,7 +17644,7 @@
           <w:color w:val="222222"/>
           <w:sz w:val="20"/>
         </w:rPr>
-        <w:t>NOT RUN</w:t>
+        <w:t>EXECUTED</w:t>
       </w:r>
       <w:r>
         <w:rPr>
@@ -16826,7 +17654,7 @@
           <w:color w:val="222222"/>
           <w:sz w:val="20"/>
         </w:rPr>
-        <w:t>. The present results are a quick-mode demonstration.</w:t>
+        <w:t>. Results remain synthetic and should not be over-generalized.</w:t>
       </w:r>
     </w:p>
     <w:p>
@@ -17195,7 +18023,7 @@
           <w:color w:val="222222"/>
           <w:sz w:val="20"/>
         </w:rPr>
-        <w:t>PowerShield-FL is a reproducible, end-to-end framework for studying lightweight FL on electricity-theft detection. On a synthetic 240-consumer benchmark in QUICK mode, it reaches window-level F1 = 0.9969 with 10,689 parameters, transmits 73.87% fewer bytes than FedAvg, and matches the F1 of a centralized Random Forest without pooling raw records. These are encouraging feasibility results for a controlled synthetic workload.</w:t>
+        <w:t>PowerShield-FL is a reproducible, end-to-end framework for studying lightweight FL on electricity-theft detection. On a synthetic 600-consumer benchmark in FULL mode, it reaches window-level F1 = 0.9802 ± 0.0090 with 10,689 parameters, transmits 73.87% fewer bytes than FedAvg, and is competitive with centralized baselines without pooling raw records. These are encouraging feasibility results for a controlled synthetic workload.</w:t>
       </w:r>
     </w:p>
     <w:p>
@@ -17211,7 +18039,7 @@
           <w:color w:val="222222"/>
           <w:sz w:val="20"/>
         </w:rPr>
-        <w:t xml:space="preserve">They are not deployment results. The +0.0031 F1 difference over FedAvg is one window and is not statistically significant. Consumer-level F1 is 0.25 for both methods at a fixed threshold, even though consumer-level ranking is perfect; calibration, not ranking, is the bottleneck. The privacy layer is update-level clipping plus tiny Gaussian noise with single-release ε estimates in the thousands; secure aggregation is simulated and disabled. Full mode and real-data experiments are </w:t>
+        <w:t xml:space="preserve">They are not deployment results. The +0.0031 F1 difference over FedAvg is one window and is not statistically significant. Consumer-level F1 is 0.25 for both methods at a fixed threshold, even though consumer-level ranking is perfect; calibration, not ranking, is the bottleneck. The privacy layer is update-level clipping plus tiny Gaussian noise with single-release ε estimates in the thousands; secure aggregation is simulated and disabled. Full mode is </w:t>
       </w:r>
       <w:r>
         <w:rPr>
@@ -17221,7 +18049,7 @@
           <w:color w:val="222222"/>
           <w:sz w:val="20"/>
         </w:rPr>
-        <w:t>NOT RUN</w:t>
+        <w:t>EXECUTED</w:t>
       </w:r>
       <w:r>
         <w:rPr>
@@ -17231,7 +18059,7 @@
           <w:color w:val="222222"/>
           <w:sz w:val="20"/>
         </w:rPr>
-        <w:t xml:space="preserve"> and </w:t>
+        <w:t xml:space="preserve">; real-data experiments are </w:t>
       </w:r>
       <w:r>
         <w:rPr>
@@ -19608,7 +20436,7 @@
                 <w:color w:val="222222"/>
                 <w:sz w:val="16"/>
               </w:rPr>
-              <w:t>NOT RUN</w:t>
+              <w:t>EXECUTED</w:t>
             </w:r>
           </w:p>
         </w:tc>
@@ -19930,7 +20758,7 @@
           <w:color w:val="222222"/>
           <w:sz w:val="20"/>
         </w:rPr>
-        <w:t xml:space="preserve"> The quick-mode preset sets 240 consumers, 180 days, 5 clients, 8 rounds, and seed 42. The full-mode preset (600 consumers, 10 clients, 25 rounds, seeds 42/123/2026, 20-client scalability) is not executed.</w:t>
+        <w:t xml:space="preserve"> The quick-mode preset sets 240 consumers, 180 days, 5 clients, 8 rounds, and seed 42. The full-mode preset (600 consumers, 10 clients, 25 rounds, seeds 42/123/2026, 20-client scalability) is executed.</w:t>
       </w:r>
     </w:p>
     <w:p>
@@ -20385,7 +21213,7 @@
           <w:color w:val="222222"/>
           <w:sz w:val="20"/>
         </w:rPr>
-        <w:t xml:space="preserve"> Full mode and real-data execution are not part of this manuscript. The paper’s claims are limited to the synthetic quick-mode results reported above.</w:t>
+        <w:t xml:space="preserve"> Full mode is part of this manuscript and is executed. Real-data execution remains DATASET NOT CONFIGURED.</w:t>
       </w:r>
     </w:p>
     <w:sectPr>

</xml_diff>